<commit_message>
docs: atualiza guia de teste dos Blocos 1-5
Co-Authored-By: Claude Sonnet 5 <noreply@anthropic.com>
</commit_message>
<xml_diff>
--- a/docs/O-que-testar-Blocos-1-a-5.docx
+++ b/docs/O-que-testar-Blocos-1-a-5.docx
@@ -1,7 +1,8 @@
 
 <file path=word/document.xml><?xml version="1.0" encoding="utf-8"?>
-<w:document xmlns:wpc="http://schemas.microsoft.com/office/word/2010/wordprocessingCanvas" xmlns:cx="http://schemas.microsoft.com/office/drawing/2014/chartex" xmlns:cx1="http://schemas.microsoft.com/office/drawing/2015/9/8/chartex" xmlns:cx2="http://schemas.microsoft.com/office/drawing/2015/10/21/chartex" xmlns:cx3="http://schemas.microsoft.com/office/drawing/2016/5/9/chartex" xmlns:cx4="http://schemas.microsoft.com/office/drawing/2016/5/10/chartex" xmlns:cx5="http://schemas.microsoft.com/office/drawing/2016/5/11/chartex" xmlns:cx6="http://schemas.microsoft.com/office/drawing/2016/5/12/chartex" xmlns:cx7="http://schemas.microsoft.com/office/drawing/2016/5/13/chartex" xmlns:cx8="http://schemas.microsoft.com/office/drawing/2016/5/14/chartex" xmlns:mc="http://schemas.openxmlformats.org/markup-compatibility/2006" xmlns:aink="http://schemas.microsoft.com/office/drawing/2016/ink" xmlns:am3d="http://schemas.microsoft.com/office/drawing/2017/model3d" xmlns:o="urn:schemas-microsoft-com:office:office" xmlns:oel="http://schemas.microsoft.com/office/2019/extlst" xmlns:r="http://schemas.openxmlformats.org/officeDocument/2006/relationships" xmlns:m="http://schemas.openxmlformats.org/officeDocument/2006/math" xmlns:v="urn:schemas-microsoft-com:vml" xmlns:wp14="http://schemas.microsoft.com/office/word/2010/wordprocessingDrawing" xmlns:wp="http://schemas.openxmlformats.org/drawingml/2006/wordprocessingDrawing" xmlns:w10="urn:schemas-microsoft-com:office:word" xmlns:w="http://schemas.openxmlformats.org/wordprocessingml/2006/main" xmlns:w14="http://schemas.microsoft.com/office/word/2010/wordml" xmlns:w15="http://schemas.microsoft.com/office/word/2012/wordml" xmlns:w16cei="http://schemas.microsoft.com/office/word/2026/wordml/cei" xmlns:w16cex="http://schemas.microsoft.com/office/word/2018/wordml/cex" xmlns:w16cid="http://schemas.microsoft.com/office/word/2016/wordml/cid" xmlns:w16="http://schemas.microsoft.com/office/word/2018/wordml" xmlns:w16du="http://schemas.microsoft.com/office/word/2023/wordml/word16du" xmlns:w16sdtdh="http://schemas.microsoft.com/office/word/2020/wordml/sdtdatahash" xmlns:w16sdtfl="http://schemas.microsoft.com/office/word/2024/wordml/sdtformatlock" xmlns:w16se="http://schemas.microsoft.com/office/word/2015/wordml/symex" xmlns:wpg="http://schemas.microsoft.com/office/word/2010/wordprocessingGroup" xmlns:wpi="http://schemas.microsoft.com/office/word/2010/wordprocessingInk" xmlns:wne="http://schemas.microsoft.com/office/word/2006/wordml" xmlns:wps="http://schemas.microsoft.com/office/word/2010/wordprocessingShape" mc:Ignorable="w14 w15 w16se w16cid w16 w16cex w16sdtdh w16sdtfl w16du wp14">
+<w:document xmlns:wpc="http://schemas.microsoft.com/office/word/2010/wordprocessingCanvas" xmlns:cx="http://schemas.microsoft.com/office/drawing/2014/chartex" xmlns:cx1="http://schemas.microsoft.com/office/drawing/2015/9/8/chartex" xmlns:cx2="http://schemas.microsoft.com/office/drawing/2015/10/21/chartex" xmlns:cx3="http://schemas.microsoft.com/office/drawing/2016/5/9/chartex" xmlns:cx4="http://schemas.microsoft.com/office/drawing/2016/5/10/chartex" xmlns:cx5="http://schemas.microsoft.com/office/drawing/2016/5/11/chartex" xmlns:cx6="http://schemas.microsoft.com/office/drawing/2016/5/12/chartex" xmlns:cx7="http://schemas.microsoft.com/office/drawing/2016/5/13/chartex" xmlns:cx8="http://schemas.microsoft.com/office/drawing/2016/5/14/chartex" xmlns:mc="http://schemas.openxmlformats.org/markup-compatibility/2006" xmlns:aink="http://schemas.microsoft.com/office/drawing/2016/ink" xmlns:am3d="http://schemas.microsoft.com/office/drawing/2017/model3d" xmlns:o="urn:schemas-microsoft-com:office:office" xmlns:oel="http://schemas.microsoft.com/office/2019/extlst" xmlns:r="http://schemas.openxmlformats.org/officeDocument/2006/relationships" xmlns:m="http://schemas.openxmlformats.org/officeDocument/2006/math" xmlns:v="urn:schemas-microsoft-com:vml" xmlns:wp14="http://schemas.microsoft.com/office/word/2010/wordprocessingDrawing" xmlns:wp="http://schemas.openxmlformats.org/drawingml/2006/wordprocessingDrawing" xmlns:w10="urn:schemas-microsoft-com:office:word" xmlns:w="http://schemas.openxmlformats.org/wordprocessingml/2006/main" xmlns:w14="http://schemas.microsoft.com/office/word/2010/wordml" xmlns:w15="http://schemas.microsoft.com/office/word/2012/wordml" xmlns:w16cex="http://schemas.microsoft.com/office/word/2018/wordml/cex" xmlns:w16cid="http://schemas.microsoft.com/office/word/2016/wordml/cid" xmlns:w16="http://schemas.microsoft.com/office/word/2018/wordml" xmlns:w16du="http://schemas.microsoft.com/office/word/2023/wordml/word16du" xmlns:w16sdtdh="http://schemas.microsoft.com/office/word/2020/wordml/sdtdatahash" xmlns:w16sdtfl="http://schemas.microsoft.com/office/word/2024/wordml/sdtformatlock" xmlns:w16se="http://schemas.microsoft.com/office/word/2015/wordml/symex" xmlns:wpg="http://schemas.microsoft.com/office/word/2010/wordprocessingGroup" xmlns:wpi="http://schemas.microsoft.com/office/word/2010/wordprocessingInk" xmlns:wne="http://schemas.microsoft.com/office/word/2006/wordml" xmlns:wps="http://schemas.microsoft.com/office/word/2010/wordprocessingShape" mc:Ignorable="w14 w15 w16se w16cid w16 w16cex w16sdtdh w16sdtfl w16du wp14">
   <w:body>
+    <w:p/>
     <w:tbl>
       <w:tblPr>
         <w:tblW w:w="5000" w:type="pct"/>
@@ -14,14 +15,17 @@
         <w:tblLook w:val="04A0" w:firstRow="1" w:lastRow="0" w:firstColumn="1" w:lastColumn="0" w:noHBand="0" w:noVBand="1"/>
       </w:tblPr>
       <w:tblGrid>
-        <w:gridCol w:w="2242"/>
-        <w:gridCol w:w="3241"/>
-        <w:gridCol w:w="3339"/>
+        <w:gridCol w:w="1987"/>
+        <w:gridCol w:w="540"/>
+        <w:gridCol w:w="540"/>
+        <w:gridCol w:w="2446"/>
+        <w:gridCol w:w="3309"/>
       </w:tblGrid>
       <w:tr>
         <w:tc>
           <w:tcPr>
             <w:tcW w:w="0" w:type="auto"/>
+            <w:gridSpan w:val="2"/>
             <w:tcBorders>
               <w:top w:val="single" w:sz="6" w:space="0" w:color="C7D2FE"/>
               <w:left w:val="single" w:sz="6" w:space="0" w:color="C7D2FE"/>
@@ -66,6 +70,7 @@
         <w:tc>
           <w:tcPr>
             <w:tcW w:w="0" w:type="auto"/>
+            <w:gridSpan w:val="2"/>
             <w:tcBorders>
               <w:top w:val="single" w:sz="6" w:space="0" w:color="C7D2FE"/>
               <w:left w:val="single" w:sz="6" w:space="0" w:color="C7D2FE"/>
@@ -160,6 +165,7 @@
         <w:tc>
           <w:tcPr>
             <w:tcW w:w="0" w:type="auto"/>
+            <w:gridSpan w:val="2"/>
             <w:tcBorders>
               <w:top w:val="single" w:sz="6" w:space="0" w:color="D8DEE9"/>
               <w:left w:val="single" w:sz="6" w:space="0" w:color="D8DEE9"/>
@@ -194,6 +200,45 @@
                 <w:szCs w:val="20"/>
               </w:rPr>
               <w:t>Endereço</w:t>
+            </w:r>
+          </w:p>
+        </w:tc>
+        <w:tc>
+          <w:tcPr>
+            <w:tcW w:w="0" w:type="auto"/>
+            <w:gridSpan w:val="2"/>
+            <w:tcBorders>
+              <w:top w:val="single" w:sz="6" w:space="0" w:color="D8DEE9"/>
+              <w:left w:val="single" w:sz="6" w:space="0" w:color="D8DEE9"/>
+              <w:bottom w:val="single" w:sz="6" w:space="0" w:color="D8DEE9"/>
+              <w:right w:val="single" w:sz="6" w:space="0" w:color="D8DEE9"/>
+            </w:tcBorders>
+            <w:tcMar>
+              <w:top w:w="120" w:type="dxa"/>
+              <w:left w:w="120" w:type="dxa"/>
+              <w:bottom w:w="120" w:type="dxa"/>
+              <w:right w:w="120" w:type="dxa"/>
+            </w:tcMar>
+            <w:hideMark/>
+          </w:tcPr>
+          <w:p>
+            <w:pPr>
+              <w:spacing w:before="160" w:after="240"/>
+              <w:rPr>
+                <w:rFonts w:ascii="Calibri" w:eastAsia="Times New Roman" w:hAnsi="Calibri" w:cs="Calibri"/>
+                <w:color w:val="1A1A1A"/>
+                <w:sz w:val="20"/>
+                <w:szCs w:val="20"/>
+              </w:rPr>
+            </w:pPr>
+            <w:r>
+              <w:rPr>
+                <w:rFonts w:ascii="Calibri" w:eastAsia="Times New Roman" w:hAnsi="Calibri" w:cs="Calibri"/>
+                <w:color w:val="1A1A1A"/>
+                <w:sz w:val="20"/>
+                <w:szCs w:val="20"/>
+              </w:rPr>
+              <w:t>https://prancheto-dev.vercel.app</w:t>
             </w:r>
           </w:p>
         </w:tc>
@@ -231,13 +276,16 @@
                 <w:sz w:val="20"/>
                 <w:szCs w:val="20"/>
               </w:rPr>
-              <w:t>https://prancheto-dev.vercel.app</w:t>
+              <w:t>https://prancheto-prod.vercel.app</w:t>
             </w:r>
           </w:p>
         </w:tc>
+      </w:tr>
+      <w:tr>
         <w:tc>
           <w:tcPr>
             <w:tcW w:w="0" w:type="auto"/>
+            <w:gridSpan w:val="2"/>
             <w:tcBorders>
               <w:top w:val="single" w:sz="6" w:space="0" w:color="D8DEE9"/>
               <w:left w:val="single" w:sz="6" w:space="0" w:color="D8DEE9"/>
@@ -265,46 +313,6 @@
             <w:r>
               <w:rPr>
                 <w:rFonts w:ascii="Calibri" w:eastAsia="Times New Roman" w:hAnsi="Calibri" w:cs="Calibri"/>
-                <w:color w:val="1A1A1A"/>
-                <w:sz w:val="20"/>
-                <w:szCs w:val="20"/>
-              </w:rPr>
-              <w:t>https://prancheto-prod.vercel.app</w:t>
-            </w:r>
-          </w:p>
-        </w:tc>
-      </w:tr>
-      <w:tr>
-        <w:tc>
-          <w:tcPr>
-            <w:tcW w:w="0" w:type="auto"/>
-            <w:tcBorders>
-              <w:top w:val="single" w:sz="6" w:space="0" w:color="D8DEE9"/>
-              <w:left w:val="single" w:sz="6" w:space="0" w:color="D8DEE9"/>
-              <w:bottom w:val="single" w:sz="6" w:space="0" w:color="D8DEE9"/>
-              <w:right w:val="single" w:sz="6" w:space="0" w:color="D8DEE9"/>
-            </w:tcBorders>
-            <w:tcMar>
-              <w:top w:w="120" w:type="dxa"/>
-              <w:left w:w="120" w:type="dxa"/>
-              <w:bottom w:w="120" w:type="dxa"/>
-              <w:right w:w="120" w:type="dxa"/>
-            </w:tcMar>
-            <w:hideMark/>
-          </w:tcPr>
-          <w:p>
-            <w:pPr>
-              <w:spacing w:before="160" w:after="240"/>
-              <w:rPr>
-                <w:rFonts w:ascii="Calibri" w:eastAsia="Times New Roman" w:hAnsi="Calibri" w:cs="Calibri"/>
-                <w:color w:val="1A1A1A"/>
-                <w:sz w:val="20"/>
-                <w:szCs w:val="20"/>
-              </w:rPr>
-            </w:pPr>
-            <w:r>
-              <w:rPr>
-                <w:rFonts w:ascii="Calibri" w:eastAsia="Times New Roman" w:hAnsi="Calibri" w:cs="Calibri"/>
                 <w:b/>
                 <w:bCs/>
                 <w:color w:val="1A1A1A"/>
@@ -344,6 +352,7 @@
         <w:tc>
           <w:tcPr>
             <w:tcW w:w="0" w:type="auto"/>
+            <w:gridSpan w:val="2"/>
             <w:tcBorders>
               <w:top w:val="single" w:sz="6" w:space="0" w:color="D8DEE9"/>
               <w:left w:val="single" w:sz="6" w:space="0" w:color="D8DEE9"/>
@@ -435,6 +444,521 @@
                 <w:szCs w:val="20"/>
               </w:rPr>
               <w:t>clientes</w:t>
+            </w:r>
+            <w:proofErr w:type="spellEnd"/>
+          </w:p>
+        </w:tc>
+      </w:tr>
+      <w:tr>
+        <w:tc>
+          <w:tcPr>
+            <w:tcW w:w="0" w:type="auto"/>
+            <w:gridSpan w:val="2"/>
+            <w:tcBorders>
+              <w:top w:val="single" w:sz="6" w:space="0" w:color="D8DEE9"/>
+              <w:left w:val="single" w:sz="6" w:space="0" w:color="D8DEE9"/>
+              <w:bottom w:val="single" w:sz="6" w:space="0" w:color="D8DEE9"/>
+              <w:right w:val="single" w:sz="6" w:space="0" w:color="D8DEE9"/>
+            </w:tcBorders>
+            <w:tcMar>
+              <w:top w:w="120" w:type="dxa"/>
+              <w:left w:w="120" w:type="dxa"/>
+              <w:bottom w:w="120" w:type="dxa"/>
+              <w:right w:w="120" w:type="dxa"/>
+            </w:tcMar>
+            <w:hideMark/>
+          </w:tcPr>
+          <w:p>
+            <w:pPr>
+              <w:spacing w:before="160" w:after="240"/>
+              <w:rPr>
+                <w:rFonts w:ascii="Calibri" w:eastAsia="Times New Roman" w:hAnsi="Calibri" w:cs="Calibri"/>
+                <w:color w:val="1A1A1A"/>
+                <w:sz w:val="20"/>
+                <w:szCs w:val="20"/>
+              </w:rPr>
+            </w:pPr>
+            <w:r>
+              <w:rPr>
+                <w:rFonts w:ascii="Calibri" w:eastAsia="Times New Roman" w:hAnsi="Calibri" w:cs="Calibri"/>
+                <w:b/>
+                <w:bCs/>
+                <w:color w:val="1A1A1A"/>
+                <w:sz w:val="20"/>
+                <w:szCs w:val="20"/>
+              </w:rPr>
+              <w:t>Dados</w:t>
+            </w:r>
+          </w:p>
+        </w:tc>
+        <w:tc>
+          <w:tcPr>
+            <w:tcW w:w="0" w:type="auto"/>
+            <w:gridSpan w:val="2"/>
+            <w:tcBorders>
+              <w:top w:val="single" w:sz="6" w:space="0" w:color="D8DEE9"/>
+              <w:left w:val="single" w:sz="6" w:space="0" w:color="D8DEE9"/>
+              <w:bottom w:val="single" w:sz="6" w:space="0" w:color="D8DEE9"/>
+              <w:right w:val="single" w:sz="6" w:space="0" w:color="D8DEE9"/>
+            </w:tcBorders>
+            <w:tcMar>
+              <w:top w:w="120" w:type="dxa"/>
+              <w:left w:w="120" w:type="dxa"/>
+              <w:bottom w:w="120" w:type="dxa"/>
+              <w:right w:w="120" w:type="dxa"/>
+            </w:tcMar>
+            <w:hideMark/>
+          </w:tcPr>
+          <w:p>
+            <w:pPr>
+              <w:spacing w:before="160" w:after="240"/>
+              <w:rPr>
+                <w:rFonts w:ascii="Calibri" w:eastAsia="Times New Roman" w:hAnsi="Calibri" w:cs="Calibri"/>
+                <w:color w:val="1A1A1A"/>
+                <w:sz w:val="20"/>
+                <w:szCs w:val="20"/>
+              </w:rPr>
+            </w:pPr>
+            <w:proofErr w:type="spellStart"/>
+            <w:r>
+              <w:rPr>
+                <w:rFonts w:ascii="Calibri" w:eastAsia="Times New Roman" w:hAnsi="Calibri" w:cs="Calibri"/>
+                <w:color w:val="1A1A1A"/>
+                <w:sz w:val="20"/>
+                <w:szCs w:val="20"/>
+              </w:rPr>
+              <w:t>Fictícios</w:t>
+            </w:r>
+            <w:proofErr w:type="spellEnd"/>
+            <w:r>
+              <w:rPr>
+                <w:rFonts w:ascii="Calibri" w:eastAsia="Times New Roman" w:hAnsi="Calibri" w:cs="Calibri"/>
+                <w:color w:val="1A1A1A"/>
+                <w:sz w:val="20"/>
+                <w:szCs w:val="20"/>
+              </w:rPr>
+              <w:t xml:space="preserve"> e </w:t>
+            </w:r>
+            <w:proofErr w:type="spellStart"/>
+            <w:r>
+              <w:rPr>
+                <w:rFonts w:ascii="Calibri" w:eastAsia="Times New Roman" w:hAnsi="Calibri" w:cs="Calibri"/>
+                <w:color w:val="1A1A1A"/>
+                <w:sz w:val="20"/>
+                <w:szCs w:val="20"/>
+              </w:rPr>
+              <w:t>descartáveis</w:t>
+            </w:r>
+            <w:proofErr w:type="spellEnd"/>
+          </w:p>
+        </w:tc>
+        <w:tc>
+          <w:tcPr>
+            <w:tcW w:w="0" w:type="auto"/>
+            <w:tcBorders>
+              <w:top w:val="single" w:sz="6" w:space="0" w:color="D8DEE9"/>
+              <w:left w:val="single" w:sz="6" w:space="0" w:color="D8DEE9"/>
+              <w:bottom w:val="single" w:sz="6" w:space="0" w:color="D8DEE9"/>
+              <w:right w:val="single" w:sz="6" w:space="0" w:color="D8DEE9"/>
+            </w:tcBorders>
+            <w:tcMar>
+              <w:top w:w="120" w:type="dxa"/>
+              <w:left w:w="120" w:type="dxa"/>
+              <w:bottom w:w="120" w:type="dxa"/>
+              <w:right w:w="120" w:type="dxa"/>
+            </w:tcMar>
+            <w:hideMark/>
+          </w:tcPr>
+          <w:p>
+            <w:pPr>
+              <w:spacing w:before="160" w:after="240"/>
+              <w:rPr>
+                <w:rFonts w:ascii="Calibri" w:eastAsia="Times New Roman" w:hAnsi="Calibri" w:cs="Calibri"/>
+                <w:color w:val="1A1A1A"/>
+                <w:sz w:val="20"/>
+                <w:szCs w:val="20"/>
+              </w:rPr>
+            </w:pPr>
+            <w:r>
+              <w:rPr>
+                <w:rFonts w:ascii="Calibri" w:eastAsia="Times New Roman" w:hAnsi="Calibri" w:cs="Calibri"/>
+                <w:color w:val="1A1A1A"/>
+                <w:sz w:val="20"/>
+                <w:szCs w:val="20"/>
+              </w:rPr>
+              <w:t>Reais</w:t>
+            </w:r>
+          </w:p>
+        </w:tc>
+      </w:tr>
+      <w:tr>
+        <w:tc>
+          <w:tcPr>
+            <w:tcW w:w="0" w:type="auto"/>
+            <w:gridSpan w:val="2"/>
+            <w:tcBorders>
+              <w:top w:val="single" w:sz="6" w:space="0" w:color="D8DEE9"/>
+              <w:left w:val="single" w:sz="6" w:space="0" w:color="D8DEE9"/>
+              <w:bottom w:val="single" w:sz="6" w:space="0" w:color="D8DEE9"/>
+              <w:right w:val="single" w:sz="6" w:space="0" w:color="D8DEE9"/>
+            </w:tcBorders>
+            <w:tcMar>
+              <w:top w:w="120" w:type="dxa"/>
+              <w:left w:w="120" w:type="dxa"/>
+              <w:bottom w:w="120" w:type="dxa"/>
+              <w:right w:w="120" w:type="dxa"/>
+            </w:tcMar>
+            <w:hideMark/>
+          </w:tcPr>
+          <w:p>
+            <w:pPr>
+              <w:spacing w:before="160" w:after="240"/>
+              <w:rPr>
+                <w:rFonts w:ascii="Calibri" w:eastAsia="Times New Roman" w:hAnsi="Calibri" w:cs="Calibri"/>
+                <w:color w:val="1A1A1A"/>
+                <w:sz w:val="20"/>
+                <w:szCs w:val="20"/>
+              </w:rPr>
+            </w:pPr>
+            <w:r>
+              <w:rPr>
+                <w:rFonts w:ascii="Calibri" w:eastAsia="Times New Roman" w:hAnsi="Calibri" w:cs="Calibri"/>
+                <w:b/>
+                <w:bCs/>
+                <w:color w:val="1A1A1A"/>
+                <w:sz w:val="20"/>
+                <w:szCs w:val="20"/>
+              </w:rPr>
+              <w:t xml:space="preserve">Como </w:t>
+            </w:r>
+            <w:proofErr w:type="spellStart"/>
+            <w:r>
+              <w:rPr>
+                <w:rFonts w:ascii="Calibri" w:eastAsia="Times New Roman" w:hAnsi="Calibri" w:cs="Calibri"/>
+                <w:b/>
+                <w:bCs/>
+                <w:color w:val="1A1A1A"/>
+                <w:sz w:val="20"/>
+                <w:szCs w:val="20"/>
+              </w:rPr>
+              <w:t>aparece</w:t>
+            </w:r>
+            <w:proofErr w:type="spellEnd"/>
+            <w:r>
+              <w:rPr>
+                <w:rFonts w:ascii="Calibri" w:eastAsia="Times New Roman" w:hAnsi="Calibri" w:cs="Calibri"/>
+                <w:b/>
+                <w:bCs/>
+                <w:color w:val="1A1A1A"/>
+                <w:sz w:val="20"/>
+                <w:szCs w:val="20"/>
+              </w:rPr>
+              <w:t xml:space="preserve"> no app</w:t>
+            </w:r>
+          </w:p>
+        </w:tc>
+        <w:tc>
+          <w:tcPr>
+            <w:tcW w:w="0" w:type="auto"/>
+            <w:gridSpan w:val="2"/>
+            <w:tcBorders>
+              <w:top w:val="single" w:sz="6" w:space="0" w:color="D8DEE9"/>
+              <w:left w:val="single" w:sz="6" w:space="0" w:color="D8DEE9"/>
+              <w:bottom w:val="single" w:sz="6" w:space="0" w:color="D8DEE9"/>
+              <w:right w:val="single" w:sz="6" w:space="0" w:color="D8DEE9"/>
+            </w:tcBorders>
+            <w:tcMar>
+              <w:top w:w="120" w:type="dxa"/>
+              <w:left w:w="120" w:type="dxa"/>
+              <w:bottom w:w="120" w:type="dxa"/>
+              <w:right w:w="120" w:type="dxa"/>
+            </w:tcMar>
+            <w:hideMark/>
+          </w:tcPr>
+          <w:p>
+            <w:pPr>
+              <w:spacing w:before="160" w:after="240"/>
+              <w:rPr>
+                <w:rFonts w:ascii="Calibri" w:eastAsia="Times New Roman" w:hAnsi="Calibri" w:cs="Calibri"/>
+                <w:color w:val="1A1A1A"/>
+                <w:sz w:val="20"/>
+                <w:szCs w:val="20"/>
+              </w:rPr>
+            </w:pPr>
+            <w:proofErr w:type="spellStart"/>
+            <w:r>
+              <w:rPr>
+                <w:rFonts w:ascii="Calibri" w:eastAsia="Times New Roman" w:hAnsi="Calibri" w:cs="Calibri"/>
+                <w:color w:val="1A1A1A"/>
+                <w:sz w:val="20"/>
+                <w:szCs w:val="20"/>
+              </w:rPr>
+              <w:t>Prancheto.IA</w:t>
+            </w:r>
+            <w:proofErr w:type="spellEnd"/>
+            <w:r>
+              <w:rPr>
+                <w:rFonts w:ascii="Calibri" w:eastAsia="Times New Roman" w:hAnsi="Calibri" w:cs="Calibri"/>
+                <w:color w:val="1A1A1A"/>
+                <w:sz w:val="20"/>
+                <w:szCs w:val="20"/>
+              </w:rPr>
+              <w:t xml:space="preserve"> [DEV]</w:t>
+            </w:r>
+          </w:p>
+        </w:tc>
+        <w:tc>
+          <w:tcPr>
+            <w:tcW w:w="0" w:type="auto"/>
+            <w:tcBorders>
+              <w:top w:val="single" w:sz="6" w:space="0" w:color="D8DEE9"/>
+              <w:left w:val="single" w:sz="6" w:space="0" w:color="D8DEE9"/>
+              <w:bottom w:val="single" w:sz="6" w:space="0" w:color="D8DEE9"/>
+              <w:right w:val="single" w:sz="6" w:space="0" w:color="D8DEE9"/>
+            </w:tcBorders>
+            <w:tcMar>
+              <w:top w:w="120" w:type="dxa"/>
+              <w:left w:w="120" w:type="dxa"/>
+              <w:bottom w:w="120" w:type="dxa"/>
+              <w:right w:w="120" w:type="dxa"/>
+            </w:tcMar>
+            <w:hideMark/>
+          </w:tcPr>
+          <w:p>
+            <w:pPr>
+              <w:spacing w:before="160" w:after="240"/>
+              <w:rPr>
+                <w:rFonts w:ascii="Calibri" w:eastAsia="Times New Roman" w:hAnsi="Calibri" w:cs="Calibri"/>
+                <w:color w:val="1A1A1A"/>
+                <w:sz w:val="20"/>
+                <w:szCs w:val="20"/>
+              </w:rPr>
+            </w:pPr>
+            <w:proofErr w:type="spellStart"/>
+            <w:r>
+              <w:rPr>
+                <w:rFonts w:ascii="Calibri" w:eastAsia="Times New Roman" w:hAnsi="Calibri" w:cs="Calibri"/>
+                <w:color w:val="1A1A1A"/>
+                <w:sz w:val="20"/>
+                <w:szCs w:val="20"/>
+              </w:rPr>
+              <w:t>Prancheto.IA</w:t>
+            </w:r>
+            <w:proofErr w:type="spellEnd"/>
+          </w:p>
+        </w:tc>
+      </w:tr>
+      <w:tr>
+        <w:tc>
+          <w:tcPr>
+            <w:tcW w:w="0" w:type="auto"/>
+            <w:tcBorders>
+              <w:top w:val="single" w:sz="6" w:space="0" w:color="C7D2FE"/>
+              <w:left w:val="single" w:sz="6" w:space="0" w:color="C7D2FE"/>
+              <w:bottom w:val="single" w:sz="6" w:space="0" w:color="C7D2FE"/>
+              <w:right w:val="single" w:sz="6" w:space="0" w:color="C7D2FE"/>
+            </w:tcBorders>
+            <w:shd w:val="clear" w:color="auto" w:fill="EEF2FF"/>
+            <w:tcMar>
+              <w:top w:w="120" w:type="dxa"/>
+              <w:left w:w="120" w:type="dxa"/>
+              <w:bottom w:w="120" w:type="dxa"/>
+              <w:right w:w="120" w:type="dxa"/>
+            </w:tcMar>
+            <w:vAlign w:val="center"/>
+            <w:hideMark/>
+          </w:tcPr>
+          <w:p>
+            <w:pPr>
+              <w:spacing w:before="160" w:after="240"/>
+              <w:rPr>
+                <w:rFonts w:ascii="Calibri" w:eastAsia="Times New Roman" w:hAnsi="Calibri" w:cs="Calibri"/>
+                <w:b/>
+                <w:bCs/>
+                <w:color w:val="312E81"/>
+                <w:sz w:val="20"/>
+                <w:szCs w:val="20"/>
+              </w:rPr>
+            </w:pPr>
+            <w:r>
+              <w:rPr>
+                <w:rFonts w:ascii="Calibri" w:eastAsia="Times New Roman" w:hAnsi="Calibri" w:cs="Calibri"/>
+                <w:b/>
+                <w:bCs/>
+                <w:color w:val="312E81"/>
+                <w:sz w:val="20"/>
+                <w:szCs w:val="20"/>
+              </w:rPr>
+              <w:t>E-mail</w:t>
+            </w:r>
+          </w:p>
+        </w:tc>
+        <w:tc>
+          <w:tcPr>
+            <w:tcW w:w="0" w:type="auto"/>
+            <w:gridSpan w:val="2"/>
+            <w:tcBorders>
+              <w:top w:val="single" w:sz="6" w:space="0" w:color="C7D2FE"/>
+              <w:left w:val="single" w:sz="6" w:space="0" w:color="C7D2FE"/>
+              <w:bottom w:val="single" w:sz="6" w:space="0" w:color="C7D2FE"/>
+              <w:right w:val="single" w:sz="6" w:space="0" w:color="C7D2FE"/>
+            </w:tcBorders>
+            <w:shd w:val="clear" w:color="auto" w:fill="EEF2FF"/>
+            <w:tcMar>
+              <w:top w:w="120" w:type="dxa"/>
+              <w:left w:w="120" w:type="dxa"/>
+              <w:bottom w:w="120" w:type="dxa"/>
+              <w:right w:w="120" w:type="dxa"/>
+            </w:tcMar>
+            <w:vAlign w:val="center"/>
+            <w:hideMark/>
+          </w:tcPr>
+          <w:p>
+            <w:pPr>
+              <w:spacing w:before="160" w:after="240"/>
+              <w:rPr>
+                <w:rFonts w:ascii="Calibri" w:eastAsia="Times New Roman" w:hAnsi="Calibri" w:cs="Calibri"/>
+                <w:b/>
+                <w:bCs/>
+                <w:color w:val="312E81"/>
+                <w:sz w:val="20"/>
+                <w:szCs w:val="20"/>
+              </w:rPr>
+            </w:pPr>
+            <w:r>
+              <w:rPr>
+                <w:rFonts w:ascii="Calibri" w:eastAsia="Times New Roman" w:hAnsi="Calibri" w:cs="Calibri"/>
+                <w:b/>
+                <w:bCs/>
+                <w:color w:val="312E81"/>
+                <w:sz w:val="20"/>
+                <w:szCs w:val="20"/>
+              </w:rPr>
+              <w:t>Senha</w:t>
+            </w:r>
+          </w:p>
+        </w:tc>
+        <w:tc>
+          <w:tcPr>
+            <w:tcW w:w="0" w:type="auto"/>
+            <w:tcBorders>
+              <w:top w:val="single" w:sz="6" w:space="0" w:color="C7D2FE"/>
+              <w:left w:val="single" w:sz="6" w:space="0" w:color="C7D2FE"/>
+              <w:bottom w:val="single" w:sz="6" w:space="0" w:color="C7D2FE"/>
+              <w:right w:val="single" w:sz="6" w:space="0" w:color="C7D2FE"/>
+            </w:tcBorders>
+            <w:shd w:val="clear" w:color="auto" w:fill="EEF2FF"/>
+            <w:tcMar>
+              <w:top w:w="120" w:type="dxa"/>
+              <w:left w:w="120" w:type="dxa"/>
+              <w:bottom w:w="120" w:type="dxa"/>
+              <w:right w:w="120" w:type="dxa"/>
+            </w:tcMar>
+            <w:vAlign w:val="center"/>
+            <w:hideMark/>
+          </w:tcPr>
+          <w:p>
+            <w:pPr>
+              <w:spacing w:before="160" w:after="240"/>
+              <w:rPr>
+                <w:rFonts w:ascii="Calibri" w:eastAsia="Times New Roman" w:hAnsi="Calibri" w:cs="Calibri"/>
+                <w:b/>
+                <w:bCs/>
+                <w:color w:val="312E81"/>
+                <w:sz w:val="20"/>
+                <w:szCs w:val="20"/>
+              </w:rPr>
+            </w:pPr>
+            <w:r>
+              <w:rPr>
+                <w:rFonts w:ascii="Calibri" w:eastAsia="Times New Roman" w:hAnsi="Calibri" w:cs="Calibri"/>
+                <w:b/>
+                <w:bCs/>
+                <w:color w:val="312E81"/>
+                <w:sz w:val="20"/>
+                <w:szCs w:val="20"/>
+              </w:rPr>
+              <w:t>Cargo</w:t>
+            </w:r>
+          </w:p>
+        </w:tc>
+        <w:tc>
+          <w:tcPr>
+            <w:tcW w:w="0" w:type="auto"/>
+            <w:tcBorders>
+              <w:top w:val="single" w:sz="6" w:space="0" w:color="C7D2FE"/>
+              <w:left w:val="single" w:sz="6" w:space="0" w:color="C7D2FE"/>
+              <w:bottom w:val="single" w:sz="6" w:space="0" w:color="C7D2FE"/>
+              <w:right w:val="single" w:sz="6" w:space="0" w:color="C7D2FE"/>
+            </w:tcBorders>
+            <w:shd w:val="clear" w:color="auto" w:fill="EEF2FF"/>
+            <w:tcMar>
+              <w:top w:w="120" w:type="dxa"/>
+              <w:left w:w="120" w:type="dxa"/>
+              <w:bottom w:w="120" w:type="dxa"/>
+              <w:right w:w="120" w:type="dxa"/>
+            </w:tcMar>
+            <w:vAlign w:val="center"/>
+            <w:hideMark/>
+          </w:tcPr>
+          <w:p>
+            <w:pPr>
+              <w:spacing w:before="160" w:after="240"/>
+              <w:rPr>
+                <w:rFonts w:ascii="Calibri" w:eastAsia="Times New Roman" w:hAnsi="Calibri" w:cs="Calibri"/>
+                <w:b/>
+                <w:bCs/>
+                <w:color w:val="312E81"/>
+                <w:sz w:val="20"/>
+                <w:szCs w:val="20"/>
+              </w:rPr>
+            </w:pPr>
+            <w:r>
+              <w:rPr>
+                <w:rFonts w:ascii="Calibri" w:eastAsia="Times New Roman" w:hAnsi="Calibri" w:cs="Calibri"/>
+                <w:b/>
+                <w:bCs/>
+                <w:color w:val="312E81"/>
+                <w:sz w:val="20"/>
+                <w:szCs w:val="20"/>
+              </w:rPr>
+              <w:t xml:space="preserve">O </w:t>
+            </w:r>
+            <w:proofErr w:type="spellStart"/>
+            <w:r>
+              <w:rPr>
+                <w:rFonts w:ascii="Calibri" w:eastAsia="Times New Roman" w:hAnsi="Calibri" w:cs="Calibri"/>
+                <w:b/>
+                <w:bCs/>
+                <w:color w:val="312E81"/>
+                <w:sz w:val="20"/>
+                <w:szCs w:val="20"/>
+              </w:rPr>
+              <w:t>que</w:t>
+            </w:r>
+            <w:proofErr w:type="spellEnd"/>
+            <w:r>
+              <w:rPr>
+                <w:rFonts w:ascii="Calibri" w:eastAsia="Times New Roman" w:hAnsi="Calibri" w:cs="Calibri"/>
+                <w:b/>
+                <w:bCs/>
+                <w:color w:val="312E81"/>
+                <w:sz w:val="20"/>
+                <w:szCs w:val="20"/>
+              </w:rPr>
+              <w:t xml:space="preserve"> </w:t>
+            </w:r>
+            <w:proofErr w:type="spellStart"/>
+            <w:r>
+              <w:rPr>
+                <w:rFonts w:ascii="Calibri" w:eastAsia="Times New Roman" w:hAnsi="Calibri" w:cs="Calibri"/>
+                <w:b/>
+                <w:bCs/>
+                <w:color w:val="312E81"/>
+                <w:sz w:val="20"/>
+                <w:szCs w:val="20"/>
+              </w:rPr>
+              <w:t>enxerga</w:t>
             </w:r>
             <w:proofErr w:type="spellEnd"/>
           </w:p>
@@ -471,13 +995,50 @@
             <w:r>
               <w:rPr>
                 <w:rFonts w:ascii="Calibri" w:eastAsia="Times New Roman" w:hAnsi="Calibri" w:cs="Calibri"/>
-                <w:b/>
-                <w:bCs/>
-                <w:color w:val="1A1A1A"/>
-                <w:sz w:val="20"/>
-                <w:szCs w:val="20"/>
-              </w:rPr>
-              <w:t>Dados</w:t>
+                <w:color w:val="1A1A1A"/>
+                <w:sz w:val="20"/>
+                <w:szCs w:val="20"/>
+              </w:rPr>
+              <w:t>admin@acme.dev</w:t>
+            </w:r>
+          </w:p>
+        </w:tc>
+        <w:tc>
+          <w:tcPr>
+            <w:tcW w:w="0" w:type="auto"/>
+            <w:gridSpan w:val="2"/>
+            <w:tcBorders>
+              <w:top w:val="single" w:sz="6" w:space="0" w:color="D8DEE9"/>
+              <w:left w:val="single" w:sz="6" w:space="0" w:color="D8DEE9"/>
+              <w:bottom w:val="single" w:sz="6" w:space="0" w:color="D8DEE9"/>
+              <w:right w:val="single" w:sz="6" w:space="0" w:color="D8DEE9"/>
+            </w:tcBorders>
+            <w:tcMar>
+              <w:top w:w="120" w:type="dxa"/>
+              <w:left w:w="120" w:type="dxa"/>
+              <w:bottom w:w="120" w:type="dxa"/>
+              <w:right w:w="120" w:type="dxa"/>
+            </w:tcMar>
+            <w:hideMark/>
+          </w:tcPr>
+          <w:p>
+            <w:pPr>
+              <w:spacing w:before="160" w:after="240"/>
+              <w:rPr>
+                <w:rFonts w:ascii="Calibri" w:eastAsia="Times New Roman" w:hAnsi="Calibri" w:cs="Calibri"/>
+                <w:color w:val="1A1A1A"/>
+                <w:sz w:val="20"/>
+                <w:szCs w:val="20"/>
+              </w:rPr>
+            </w:pPr>
+            <w:r>
+              <w:rPr>
+                <w:rFonts w:ascii="Calibri" w:eastAsia="Times New Roman" w:hAnsi="Calibri" w:cs="Calibri"/>
+                <w:color w:val="1A1A1A"/>
+                <w:sz w:val="20"/>
+                <w:szCs w:val="20"/>
+              </w:rPr>
+              <w:t>prancheto-dev-2026</w:t>
             </w:r>
           </w:p>
         </w:tc>
@@ -516,7 +1077,7 @@
                 <w:sz w:val="20"/>
                 <w:szCs w:val="20"/>
               </w:rPr>
-              <w:t>Fictícios</w:t>
+              <w:t>Líder</w:t>
             </w:r>
             <w:proofErr w:type="spellEnd"/>
             <w:r>
@@ -526,19 +1087,8 @@
                 <w:sz w:val="20"/>
                 <w:szCs w:val="20"/>
               </w:rPr>
-              <w:t xml:space="preserve"> e </w:t>
-            </w:r>
-            <w:proofErr w:type="spellStart"/>
-            <w:r>
-              <w:rPr>
-                <w:rFonts w:ascii="Calibri" w:eastAsia="Times New Roman" w:hAnsi="Calibri" w:cs="Calibri"/>
-                <w:color w:val="1A1A1A"/>
-                <w:sz w:val="20"/>
-                <w:szCs w:val="20"/>
-              </w:rPr>
-              <w:t>descartáveis</w:t>
-            </w:r>
-            <w:proofErr w:type="spellEnd"/>
+              <w:t xml:space="preserve"> Geral</w:t>
+            </w:r>
           </w:p>
         </w:tc>
         <w:tc>
@@ -566,6 +1116,7 @@
                 <w:color w:val="1A1A1A"/>
                 <w:sz w:val="20"/>
                 <w:szCs w:val="20"/>
+                <w:lang w:val="pt-BR"/>
               </w:rPr>
             </w:pPr>
             <w:r>
@@ -574,8 +1125,9 @@
                 <w:color w:val="1A1A1A"/>
                 <w:sz w:val="20"/>
                 <w:szCs w:val="20"/>
-              </w:rPr>
-              <w:t>Reais</w:t>
+                <w:lang w:val="pt-BR"/>
+              </w:rPr>
+              <w:t>Tudo: Organização, Cargos, Times, Identidade Visual</w:t>
             </w:r>
           </w:p>
         </w:tc>
@@ -611,37 +1163,50 @@
             <w:r>
               <w:rPr>
                 <w:rFonts w:ascii="Calibri" w:eastAsia="Times New Roman" w:hAnsi="Calibri" w:cs="Calibri"/>
-                <w:b/>
-                <w:bCs/>
-                <w:color w:val="1A1A1A"/>
-                <w:sz w:val="20"/>
-                <w:szCs w:val="20"/>
-              </w:rPr>
-              <w:t xml:space="preserve">Como </w:t>
-            </w:r>
-            <w:proofErr w:type="spellStart"/>
-            <w:r>
-              <w:rPr>
-                <w:rFonts w:ascii="Calibri" w:eastAsia="Times New Roman" w:hAnsi="Calibri" w:cs="Calibri"/>
-                <w:b/>
-                <w:bCs/>
-                <w:color w:val="1A1A1A"/>
-                <w:sz w:val="20"/>
-                <w:szCs w:val="20"/>
-              </w:rPr>
-              <w:t>aparece</w:t>
-            </w:r>
-            <w:proofErr w:type="spellEnd"/>
-            <w:r>
-              <w:rPr>
-                <w:rFonts w:ascii="Calibri" w:eastAsia="Times New Roman" w:hAnsi="Calibri" w:cs="Calibri"/>
-                <w:b/>
-                <w:bCs/>
-                <w:color w:val="1A1A1A"/>
-                <w:sz w:val="20"/>
-                <w:szCs w:val="20"/>
-              </w:rPr>
-              <w:t xml:space="preserve"> no app</w:t>
+                <w:color w:val="1A1A1A"/>
+                <w:sz w:val="20"/>
+                <w:szCs w:val="20"/>
+              </w:rPr>
+              <w:t>gerente@acme.dev</w:t>
+            </w:r>
+          </w:p>
+        </w:tc>
+        <w:tc>
+          <w:tcPr>
+            <w:tcW w:w="0" w:type="auto"/>
+            <w:gridSpan w:val="2"/>
+            <w:tcBorders>
+              <w:top w:val="single" w:sz="6" w:space="0" w:color="D8DEE9"/>
+              <w:left w:val="single" w:sz="6" w:space="0" w:color="D8DEE9"/>
+              <w:bottom w:val="single" w:sz="6" w:space="0" w:color="D8DEE9"/>
+              <w:right w:val="single" w:sz="6" w:space="0" w:color="D8DEE9"/>
+            </w:tcBorders>
+            <w:tcMar>
+              <w:top w:w="120" w:type="dxa"/>
+              <w:left w:w="120" w:type="dxa"/>
+              <w:bottom w:w="120" w:type="dxa"/>
+              <w:right w:w="120" w:type="dxa"/>
+            </w:tcMar>
+            <w:hideMark/>
+          </w:tcPr>
+          <w:p>
+            <w:pPr>
+              <w:spacing w:before="160" w:after="240"/>
+              <w:rPr>
+                <w:rFonts w:ascii="Calibri" w:eastAsia="Times New Roman" w:hAnsi="Calibri" w:cs="Calibri"/>
+                <w:color w:val="1A1A1A"/>
+                <w:sz w:val="20"/>
+                <w:szCs w:val="20"/>
+              </w:rPr>
+            </w:pPr>
+            <w:r>
+              <w:rPr>
+                <w:rFonts w:ascii="Calibri" w:eastAsia="Times New Roman" w:hAnsi="Calibri" w:cs="Calibri"/>
+                <w:color w:val="1A1A1A"/>
+                <w:sz w:val="20"/>
+                <w:szCs w:val="20"/>
+              </w:rPr>
+              <w:t>prancheto-dev-2026</w:t>
             </w:r>
           </w:p>
         </w:tc>
@@ -680,7 +1245,7 @@
                 <w:sz w:val="20"/>
                 <w:szCs w:val="20"/>
               </w:rPr>
-              <w:t>Prancheto.IA</w:t>
+              <w:t>Líder</w:t>
             </w:r>
             <w:proofErr w:type="spellEnd"/>
             <w:r>
@@ -690,7 +1255,7 @@
                 <w:sz w:val="20"/>
                 <w:szCs w:val="20"/>
               </w:rPr>
-              <w:t xml:space="preserve"> [DEV]</w:t>
+              <w:t xml:space="preserve"> de Time</w:t>
             </w:r>
           </w:p>
         </w:tc>
@@ -719,252 +1284,19 @@
                 <w:color w:val="1A1A1A"/>
                 <w:sz w:val="20"/>
                 <w:szCs w:val="20"/>
+                <w:lang w:val="pt-BR"/>
               </w:rPr>
             </w:pPr>
-            <w:proofErr w:type="spellStart"/>
-            <w:r>
-              <w:rPr>
-                <w:rFonts w:ascii="Calibri" w:eastAsia="Times New Roman" w:hAnsi="Calibri" w:cs="Calibri"/>
-                <w:color w:val="1A1A1A"/>
-                <w:sz w:val="20"/>
-                <w:szCs w:val="20"/>
-              </w:rPr>
-              <w:t>Prancheto.IA</w:t>
-            </w:r>
-            <w:proofErr w:type="spellEnd"/>
-          </w:p>
-        </w:tc>
-      </w:tr>
-    </w:tbl>
-    <w:tbl>
-      <w:tblPr>
-        <w:tblW w:w="5000" w:type="pct"/>
-        <w:tblCellMar>
-          <w:top w:w="15" w:type="dxa"/>
-          <w:left w:w="15" w:type="dxa"/>
-          <w:bottom w:w="15" w:type="dxa"/>
-          <w:right w:w="15" w:type="dxa"/>
-        </w:tblCellMar>
-        <w:tblLook w:val="04A0" w:firstRow="1" w:lastRow="0" w:firstColumn="1" w:lastColumn="0" w:noHBand="0" w:noVBand="1"/>
-      </w:tblPr>
-      <w:tblGrid>
-        <w:gridCol w:w="1904"/>
-        <w:gridCol w:w="1719"/>
-        <w:gridCol w:w="1482"/>
-        <w:gridCol w:w="3717"/>
-      </w:tblGrid>
-      <w:tr>
-        <w:tc>
-          <w:tcPr>
-            <w:tcW w:w="0" w:type="auto"/>
-            <w:tcBorders>
-              <w:top w:val="single" w:sz="6" w:space="0" w:color="C7D2FE"/>
-              <w:left w:val="single" w:sz="6" w:space="0" w:color="C7D2FE"/>
-              <w:bottom w:val="single" w:sz="6" w:space="0" w:color="C7D2FE"/>
-              <w:right w:val="single" w:sz="6" w:space="0" w:color="C7D2FE"/>
-            </w:tcBorders>
-            <w:shd w:val="clear" w:color="auto" w:fill="EEF2FF"/>
-            <w:tcMar>
-              <w:top w:w="120" w:type="dxa"/>
-              <w:left w:w="120" w:type="dxa"/>
-              <w:bottom w:w="120" w:type="dxa"/>
-              <w:right w:w="120" w:type="dxa"/>
-            </w:tcMar>
-            <w:vAlign w:val="center"/>
-            <w:hideMark/>
-          </w:tcPr>
-          <w:p>
-            <w:pPr>
-              <w:spacing w:before="160" w:after="240"/>
-              <w:rPr>
-                <w:rFonts w:ascii="Calibri" w:eastAsia="Times New Roman" w:hAnsi="Calibri" w:cs="Calibri"/>
-                <w:b/>
-                <w:bCs/>
-                <w:color w:val="312E81"/>
-                <w:sz w:val="20"/>
-                <w:szCs w:val="20"/>
-              </w:rPr>
-            </w:pPr>
-            <w:r>
-              <w:rPr>
-                <w:rFonts w:ascii="Calibri" w:eastAsia="Times New Roman" w:hAnsi="Calibri" w:cs="Calibri"/>
-                <w:b/>
-                <w:bCs/>
-                <w:color w:val="312E81"/>
-                <w:sz w:val="20"/>
-                <w:szCs w:val="20"/>
-              </w:rPr>
-              <w:t>E-mail</w:t>
-            </w:r>
-          </w:p>
-        </w:tc>
-        <w:tc>
-          <w:tcPr>
-            <w:tcW w:w="0" w:type="auto"/>
-            <w:tcBorders>
-              <w:top w:val="single" w:sz="6" w:space="0" w:color="C7D2FE"/>
-              <w:left w:val="single" w:sz="6" w:space="0" w:color="C7D2FE"/>
-              <w:bottom w:val="single" w:sz="6" w:space="0" w:color="C7D2FE"/>
-              <w:right w:val="single" w:sz="6" w:space="0" w:color="C7D2FE"/>
-            </w:tcBorders>
-            <w:shd w:val="clear" w:color="auto" w:fill="EEF2FF"/>
-            <w:tcMar>
-              <w:top w:w="120" w:type="dxa"/>
-              <w:left w:w="120" w:type="dxa"/>
-              <w:bottom w:w="120" w:type="dxa"/>
-              <w:right w:w="120" w:type="dxa"/>
-            </w:tcMar>
-            <w:vAlign w:val="center"/>
-            <w:hideMark/>
-          </w:tcPr>
-          <w:p>
-            <w:pPr>
-              <w:spacing w:before="160" w:after="240"/>
-              <w:rPr>
-                <w:rFonts w:ascii="Calibri" w:eastAsia="Times New Roman" w:hAnsi="Calibri" w:cs="Calibri"/>
-                <w:b/>
-                <w:bCs/>
-                <w:color w:val="312E81"/>
-                <w:sz w:val="20"/>
-                <w:szCs w:val="20"/>
-              </w:rPr>
-            </w:pPr>
-            <w:r>
-              <w:rPr>
-                <w:rFonts w:ascii="Calibri" w:eastAsia="Times New Roman" w:hAnsi="Calibri" w:cs="Calibri"/>
-                <w:b/>
-                <w:bCs/>
-                <w:color w:val="312E81"/>
-                <w:sz w:val="20"/>
-                <w:szCs w:val="20"/>
-              </w:rPr>
-              <w:t>Senha</w:t>
-            </w:r>
-          </w:p>
-        </w:tc>
-        <w:tc>
-          <w:tcPr>
-            <w:tcW w:w="0" w:type="auto"/>
-            <w:tcBorders>
-              <w:top w:val="single" w:sz="6" w:space="0" w:color="C7D2FE"/>
-              <w:left w:val="single" w:sz="6" w:space="0" w:color="C7D2FE"/>
-              <w:bottom w:val="single" w:sz="6" w:space="0" w:color="C7D2FE"/>
-              <w:right w:val="single" w:sz="6" w:space="0" w:color="C7D2FE"/>
-            </w:tcBorders>
-            <w:shd w:val="clear" w:color="auto" w:fill="EEF2FF"/>
-            <w:tcMar>
-              <w:top w:w="120" w:type="dxa"/>
-              <w:left w:w="120" w:type="dxa"/>
-              <w:bottom w:w="120" w:type="dxa"/>
-              <w:right w:w="120" w:type="dxa"/>
-            </w:tcMar>
-            <w:vAlign w:val="center"/>
-            <w:hideMark/>
-          </w:tcPr>
-          <w:p>
-            <w:pPr>
-              <w:spacing w:before="160" w:after="240"/>
-              <w:rPr>
-                <w:rFonts w:ascii="Calibri" w:eastAsia="Times New Roman" w:hAnsi="Calibri" w:cs="Calibri"/>
-                <w:b/>
-                <w:bCs/>
-                <w:color w:val="312E81"/>
-                <w:sz w:val="20"/>
-                <w:szCs w:val="20"/>
-              </w:rPr>
-            </w:pPr>
-            <w:r>
-              <w:rPr>
-                <w:rFonts w:ascii="Calibri" w:eastAsia="Times New Roman" w:hAnsi="Calibri" w:cs="Calibri"/>
-                <w:b/>
-                <w:bCs/>
-                <w:color w:val="312E81"/>
-                <w:sz w:val="20"/>
-                <w:szCs w:val="20"/>
-              </w:rPr>
-              <w:t>Cargo</w:t>
-            </w:r>
-          </w:p>
-        </w:tc>
-        <w:tc>
-          <w:tcPr>
-            <w:tcW w:w="0" w:type="auto"/>
-            <w:tcBorders>
-              <w:top w:val="single" w:sz="6" w:space="0" w:color="C7D2FE"/>
-              <w:left w:val="single" w:sz="6" w:space="0" w:color="C7D2FE"/>
-              <w:bottom w:val="single" w:sz="6" w:space="0" w:color="C7D2FE"/>
-              <w:right w:val="single" w:sz="6" w:space="0" w:color="C7D2FE"/>
-            </w:tcBorders>
-            <w:shd w:val="clear" w:color="auto" w:fill="EEF2FF"/>
-            <w:tcMar>
-              <w:top w:w="120" w:type="dxa"/>
-              <w:left w:w="120" w:type="dxa"/>
-              <w:bottom w:w="120" w:type="dxa"/>
-              <w:right w:w="120" w:type="dxa"/>
-            </w:tcMar>
-            <w:vAlign w:val="center"/>
-            <w:hideMark/>
-          </w:tcPr>
-          <w:p>
-            <w:pPr>
-              <w:spacing w:before="160" w:after="240"/>
-              <w:rPr>
-                <w:rFonts w:ascii="Calibri" w:eastAsia="Times New Roman" w:hAnsi="Calibri" w:cs="Calibri"/>
-                <w:b/>
-                <w:bCs/>
-                <w:color w:val="312E81"/>
-                <w:sz w:val="20"/>
-                <w:szCs w:val="20"/>
-              </w:rPr>
-            </w:pPr>
-            <w:r>
-              <w:rPr>
-                <w:rFonts w:ascii="Calibri" w:eastAsia="Times New Roman" w:hAnsi="Calibri" w:cs="Calibri"/>
-                <w:b/>
-                <w:bCs/>
-                <w:color w:val="312E81"/>
-                <w:sz w:val="20"/>
-                <w:szCs w:val="20"/>
-              </w:rPr>
-              <w:t xml:space="preserve">O </w:t>
-            </w:r>
-            <w:proofErr w:type="spellStart"/>
-            <w:r>
-              <w:rPr>
-                <w:rFonts w:ascii="Calibri" w:eastAsia="Times New Roman" w:hAnsi="Calibri" w:cs="Calibri"/>
-                <w:b/>
-                <w:bCs/>
-                <w:color w:val="312E81"/>
-                <w:sz w:val="20"/>
-                <w:szCs w:val="20"/>
-              </w:rPr>
-              <w:t>que</w:t>
-            </w:r>
-            <w:proofErr w:type="spellEnd"/>
-            <w:r>
-              <w:rPr>
-                <w:rFonts w:ascii="Calibri" w:eastAsia="Times New Roman" w:hAnsi="Calibri" w:cs="Calibri"/>
-                <w:b/>
-                <w:bCs/>
-                <w:color w:val="312E81"/>
-                <w:sz w:val="20"/>
-                <w:szCs w:val="20"/>
-              </w:rPr>
-              <w:t xml:space="preserve"> </w:t>
-            </w:r>
-            <w:proofErr w:type="spellStart"/>
-            <w:r>
-              <w:rPr>
-                <w:rFonts w:ascii="Calibri" w:eastAsia="Times New Roman" w:hAnsi="Calibri" w:cs="Calibri"/>
-                <w:b/>
-                <w:bCs/>
-                <w:color w:val="312E81"/>
-                <w:sz w:val="20"/>
-                <w:szCs w:val="20"/>
-              </w:rPr>
-              <w:t>enxerga</w:t>
-            </w:r>
-            <w:proofErr w:type="spellEnd"/>
+            <w:r>
+              <w:rPr>
+                <w:rFonts w:ascii="Calibri" w:eastAsia="Times New Roman" w:hAnsi="Calibri" w:cs="Calibri"/>
+                <w:color w:val="1A1A1A"/>
+                <w:sz w:val="20"/>
+                <w:szCs w:val="20"/>
+                <w:lang w:val="pt-BR"/>
+              </w:rPr>
+              <w:t>Gerencia seu time; sem exclusões</w:t>
+            </w:r>
           </w:p>
         </w:tc>
       </w:tr>
@@ -1003,7 +1335,46 @@
                 <w:sz w:val="20"/>
                 <w:szCs w:val="20"/>
               </w:rPr>
-              <w:t>admin@acme.dev</w:t>
+              <w:t>membro@acme.dev</w:t>
+            </w:r>
+          </w:p>
+        </w:tc>
+        <w:tc>
+          <w:tcPr>
+            <w:tcW w:w="0" w:type="auto"/>
+            <w:gridSpan w:val="2"/>
+            <w:tcBorders>
+              <w:top w:val="single" w:sz="6" w:space="0" w:color="D8DEE9"/>
+              <w:left w:val="single" w:sz="6" w:space="0" w:color="D8DEE9"/>
+              <w:bottom w:val="single" w:sz="6" w:space="0" w:color="D8DEE9"/>
+              <w:right w:val="single" w:sz="6" w:space="0" w:color="D8DEE9"/>
+            </w:tcBorders>
+            <w:tcMar>
+              <w:top w:w="120" w:type="dxa"/>
+              <w:left w:w="120" w:type="dxa"/>
+              <w:bottom w:w="120" w:type="dxa"/>
+              <w:right w:w="120" w:type="dxa"/>
+            </w:tcMar>
+            <w:hideMark/>
+          </w:tcPr>
+          <w:p>
+            <w:pPr>
+              <w:spacing w:before="160" w:after="240"/>
+              <w:rPr>
+                <w:rFonts w:ascii="Calibri" w:eastAsia="Times New Roman" w:hAnsi="Calibri" w:cs="Calibri"/>
+                <w:color w:val="1A1A1A"/>
+                <w:sz w:val="20"/>
+                <w:szCs w:val="20"/>
+              </w:rPr>
+            </w:pPr>
+            <w:r>
+              <w:rPr>
+                <w:rFonts w:ascii="Calibri" w:eastAsia="Times New Roman" w:hAnsi="Calibri" w:cs="Calibri"/>
+                <w:color w:val="1A1A1A"/>
+                <w:sz w:val="20"/>
+                <w:szCs w:val="20"/>
+              </w:rPr>
+              <w:t>prancheto-dev-2026</w:t>
             </w:r>
           </w:p>
         </w:tc>
@@ -1034,14 +1405,25 @@
                 <w:szCs w:val="20"/>
               </w:rPr>
             </w:pPr>
-            <w:r>
-              <w:rPr>
-                <w:rFonts w:ascii="Calibri" w:eastAsia="Times New Roman" w:hAnsi="Calibri" w:cs="Calibri"/>
-                <w:color w:val="1A1A1A"/>
-                <w:sz w:val="20"/>
-                <w:szCs w:val="20"/>
-              </w:rPr>
-              <w:t>prancheto-dev-2026</w:t>
+            <w:proofErr w:type="spellStart"/>
+            <w:r>
+              <w:rPr>
+                <w:rFonts w:ascii="Calibri" w:eastAsia="Times New Roman" w:hAnsi="Calibri" w:cs="Calibri"/>
+                <w:color w:val="1A1A1A"/>
+                <w:sz w:val="20"/>
+                <w:szCs w:val="20"/>
+              </w:rPr>
+              <w:t>Membro</w:t>
+            </w:r>
+            <w:proofErr w:type="spellEnd"/>
+            <w:r>
+              <w:rPr>
+                <w:rFonts w:ascii="Calibri" w:eastAsia="Times New Roman" w:hAnsi="Calibri" w:cs="Calibri"/>
+                <w:color w:val="1A1A1A"/>
+                <w:sz w:val="20"/>
+                <w:szCs w:val="20"/>
+              </w:rPr>
+              <w:t xml:space="preserve"> de Time</w:t>
             </w:r>
           </w:p>
         </w:tc>
@@ -1070,390 +1452,6 @@
                 <w:color w:val="1A1A1A"/>
                 <w:sz w:val="20"/>
                 <w:szCs w:val="20"/>
-              </w:rPr>
-            </w:pPr>
-            <w:proofErr w:type="spellStart"/>
-            <w:r>
-              <w:rPr>
-                <w:rFonts w:ascii="Calibri" w:eastAsia="Times New Roman" w:hAnsi="Calibri" w:cs="Calibri"/>
-                <w:color w:val="1A1A1A"/>
-                <w:sz w:val="20"/>
-                <w:szCs w:val="20"/>
-              </w:rPr>
-              <w:t>Líder</w:t>
-            </w:r>
-            <w:proofErr w:type="spellEnd"/>
-            <w:r>
-              <w:rPr>
-                <w:rFonts w:ascii="Calibri" w:eastAsia="Times New Roman" w:hAnsi="Calibri" w:cs="Calibri"/>
-                <w:color w:val="1A1A1A"/>
-                <w:sz w:val="20"/>
-                <w:szCs w:val="20"/>
-              </w:rPr>
-              <w:t xml:space="preserve"> Geral</w:t>
-            </w:r>
-          </w:p>
-        </w:tc>
-        <w:tc>
-          <w:tcPr>
-            <w:tcW w:w="0" w:type="auto"/>
-            <w:tcBorders>
-              <w:top w:val="single" w:sz="6" w:space="0" w:color="D8DEE9"/>
-              <w:left w:val="single" w:sz="6" w:space="0" w:color="D8DEE9"/>
-              <w:bottom w:val="single" w:sz="6" w:space="0" w:color="D8DEE9"/>
-              <w:right w:val="single" w:sz="6" w:space="0" w:color="D8DEE9"/>
-            </w:tcBorders>
-            <w:tcMar>
-              <w:top w:w="120" w:type="dxa"/>
-              <w:left w:w="120" w:type="dxa"/>
-              <w:bottom w:w="120" w:type="dxa"/>
-              <w:right w:w="120" w:type="dxa"/>
-            </w:tcMar>
-            <w:hideMark/>
-          </w:tcPr>
-          <w:p>
-            <w:pPr>
-              <w:spacing w:before="160" w:after="240"/>
-              <w:rPr>
-                <w:rFonts w:ascii="Calibri" w:eastAsia="Times New Roman" w:hAnsi="Calibri" w:cs="Calibri"/>
-                <w:color w:val="1A1A1A"/>
-                <w:sz w:val="20"/>
-                <w:szCs w:val="20"/>
-                <w:lang w:val="pt-BR"/>
-              </w:rPr>
-            </w:pPr>
-            <w:r>
-              <w:rPr>
-                <w:rFonts w:ascii="Calibri" w:eastAsia="Times New Roman" w:hAnsi="Calibri" w:cs="Calibri"/>
-                <w:color w:val="1A1A1A"/>
-                <w:sz w:val="20"/>
-                <w:szCs w:val="20"/>
-                <w:lang w:val="pt-BR"/>
-              </w:rPr>
-              <w:t>Tudo: Organização, Cargos, Times, Identidade Visual</w:t>
-            </w:r>
-          </w:p>
-        </w:tc>
-      </w:tr>
-      <w:tr>
-        <w:tc>
-          <w:tcPr>
-            <w:tcW w:w="0" w:type="auto"/>
-            <w:tcBorders>
-              <w:top w:val="single" w:sz="6" w:space="0" w:color="D8DEE9"/>
-              <w:left w:val="single" w:sz="6" w:space="0" w:color="D8DEE9"/>
-              <w:bottom w:val="single" w:sz="6" w:space="0" w:color="D8DEE9"/>
-              <w:right w:val="single" w:sz="6" w:space="0" w:color="D8DEE9"/>
-            </w:tcBorders>
-            <w:tcMar>
-              <w:top w:w="120" w:type="dxa"/>
-              <w:left w:w="120" w:type="dxa"/>
-              <w:bottom w:w="120" w:type="dxa"/>
-              <w:right w:w="120" w:type="dxa"/>
-            </w:tcMar>
-            <w:hideMark/>
-          </w:tcPr>
-          <w:p>
-            <w:pPr>
-              <w:spacing w:before="160" w:after="240"/>
-              <w:rPr>
-                <w:rFonts w:ascii="Calibri" w:eastAsia="Times New Roman" w:hAnsi="Calibri" w:cs="Calibri"/>
-                <w:color w:val="1A1A1A"/>
-                <w:sz w:val="20"/>
-                <w:szCs w:val="20"/>
-              </w:rPr>
-            </w:pPr>
-            <w:r>
-              <w:rPr>
-                <w:rFonts w:ascii="Calibri" w:eastAsia="Times New Roman" w:hAnsi="Calibri" w:cs="Calibri"/>
-                <w:color w:val="1A1A1A"/>
-                <w:sz w:val="20"/>
-                <w:szCs w:val="20"/>
-              </w:rPr>
-              <w:lastRenderedPageBreak/>
-              <w:t>gerente@acme.dev</w:t>
-            </w:r>
-          </w:p>
-        </w:tc>
-        <w:tc>
-          <w:tcPr>
-            <w:tcW w:w="0" w:type="auto"/>
-            <w:tcBorders>
-              <w:top w:val="single" w:sz="6" w:space="0" w:color="D8DEE9"/>
-              <w:left w:val="single" w:sz="6" w:space="0" w:color="D8DEE9"/>
-              <w:bottom w:val="single" w:sz="6" w:space="0" w:color="D8DEE9"/>
-              <w:right w:val="single" w:sz="6" w:space="0" w:color="D8DEE9"/>
-            </w:tcBorders>
-            <w:tcMar>
-              <w:top w:w="120" w:type="dxa"/>
-              <w:left w:w="120" w:type="dxa"/>
-              <w:bottom w:w="120" w:type="dxa"/>
-              <w:right w:w="120" w:type="dxa"/>
-            </w:tcMar>
-            <w:hideMark/>
-          </w:tcPr>
-          <w:p>
-            <w:pPr>
-              <w:spacing w:before="160" w:after="240"/>
-              <w:rPr>
-                <w:rFonts w:ascii="Calibri" w:eastAsia="Times New Roman" w:hAnsi="Calibri" w:cs="Calibri"/>
-                <w:color w:val="1A1A1A"/>
-                <w:sz w:val="20"/>
-                <w:szCs w:val="20"/>
-              </w:rPr>
-            </w:pPr>
-            <w:r>
-              <w:rPr>
-                <w:rFonts w:ascii="Calibri" w:eastAsia="Times New Roman" w:hAnsi="Calibri" w:cs="Calibri"/>
-                <w:color w:val="1A1A1A"/>
-                <w:sz w:val="20"/>
-                <w:szCs w:val="20"/>
-              </w:rPr>
-              <w:t>prancheto-dev-2026</w:t>
-            </w:r>
-          </w:p>
-        </w:tc>
-        <w:tc>
-          <w:tcPr>
-            <w:tcW w:w="0" w:type="auto"/>
-            <w:tcBorders>
-              <w:top w:val="single" w:sz="6" w:space="0" w:color="D8DEE9"/>
-              <w:left w:val="single" w:sz="6" w:space="0" w:color="D8DEE9"/>
-              <w:bottom w:val="single" w:sz="6" w:space="0" w:color="D8DEE9"/>
-              <w:right w:val="single" w:sz="6" w:space="0" w:color="D8DEE9"/>
-            </w:tcBorders>
-            <w:tcMar>
-              <w:top w:w="120" w:type="dxa"/>
-              <w:left w:w="120" w:type="dxa"/>
-              <w:bottom w:w="120" w:type="dxa"/>
-              <w:right w:w="120" w:type="dxa"/>
-            </w:tcMar>
-            <w:hideMark/>
-          </w:tcPr>
-          <w:p>
-            <w:pPr>
-              <w:spacing w:before="160" w:after="240"/>
-              <w:rPr>
-                <w:rFonts w:ascii="Calibri" w:eastAsia="Times New Roman" w:hAnsi="Calibri" w:cs="Calibri"/>
-                <w:color w:val="1A1A1A"/>
-                <w:sz w:val="20"/>
-                <w:szCs w:val="20"/>
-              </w:rPr>
-            </w:pPr>
-            <w:proofErr w:type="spellStart"/>
-            <w:r>
-              <w:rPr>
-                <w:rFonts w:ascii="Calibri" w:eastAsia="Times New Roman" w:hAnsi="Calibri" w:cs="Calibri"/>
-                <w:color w:val="1A1A1A"/>
-                <w:sz w:val="20"/>
-                <w:szCs w:val="20"/>
-              </w:rPr>
-              <w:t>Líder</w:t>
-            </w:r>
-            <w:proofErr w:type="spellEnd"/>
-            <w:r>
-              <w:rPr>
-                <w:rFonts w:ascii="Calibri" w:eastAsia="Times New Roman" w:hAnsi="Calibri" w:cs="Calibri"/>
-                <w:color w:val="1A1A1A"/>
-                <w:sz w:val="20"/>
-                <w:szCs w:val="20"/>
-              </w:rPr>
-              <w:t xml:space="preserve"> de Time</w:t>
-            </w:r>
-          </w:p>
-        </w:tc>
-        <w:tc>
-          <w:tcPr>
-            <w:tcW w:w="0" w:type="auto"/>
-            <w:tcBorders>
-              <w:top w:val="single" w:sz="6" w:space="0" w:color="D8DEE9"/>
-              <w:left w:val="single" w:sz="6" w:space="0" w:color="D8DEE9"/>
-              <w:bottom w:val="single" w:sz="6" w:space="0" w:color="D8DEE9"/>
-              <w:right w:val="single" w:sz="6" w:space="0" w:color="D8DEE9"/>
-            </w:tcBorders>
-            <w:tcMar>
-              <w:top w:w="120" w:type="dxa"/>
-              <w:left w:w="120" w:type="dxa"/>
-              <w:bottom w:w="120" w:type="dxa"/>
-              <w:right w:w="120" w:type="dxa"/>
-            </w:tcMar>
-            <w:hideMark/>
-          </w:tcPr>
-          <w:p>
-            <w:pPr>
-              <w:spacing w:before="160" w:after="240"/>
-              <w:rPr>
-                <w:rFonts w:ascii="Calibri" w:eastAsia="Times New Roman" w:hAnsi="Calibri" w:cs="Calibri"/>
-                <w:color w:val="1A1A1A"/>
-                <w:sz w:val="20"/>
-                <w:szCs w:val="20"/>
-                <w:lang w:val="pt-BR"/>
-              </w:rPr>
-            </w:pPr>
-            <w:r>
-              <w:rPr>
-                <w:rFonts w:ascii="Calibri" w:eastAsia="Times New Roman" w:hAnsi="Calibri" w:cs="Calibri"/>
-                <w:color w:val="1A1A1A"/>
-                <w:sz w:val="20"/>
-                <w:szCs w:val="20"/>
-                <w:lang w:val="pt-BR"/>
-              </w:rPr>
-              <w:t>Gerencia seu time; sem exclusões</w:t>
-            </w:r>
-          </w:p>
-        </w:tc>
-      </w:tr>
-      <w:tr>
-        <w:tc>
-          <w:tcPr>
-            <w:tcW w:w="0" w:type="auto"/>
-            <w:tcBorders>
-              <w:top w:val="single" w:sz="6" w:space="0" w:color="D8DEE9"/>
-              <w:left w:val="single" w:sz="6" w:space="0" w:color="D8DEE9"/>
-              <w:bottom w:val="single" w:sz="6" w:space="0" w:color="D8DEE9"/>
-              <w:right w:val="single" w:sz="6" w:space="0" w:color="D8DEE9"/>
-            </w:tcBorders>
-            <w:tcMar>
-              <w:top w:w="120" w:type="dxa"/>
-              <w:left w:w="120" w:type="dxa"/>
-              <w:bottom w:w="120" w:type="dxa"/>
-              <w:right w:w="120" w:type="dxa"/>
-            </w:tcMar>
-            <w:hideMark/>
-          </w:tcPr>
-          <w:p>
-            <w:pPr>
-              <w:spacing w:before="160" w:after="240"/>
-              <w:rPr>
-                <w:rFonts w:ascii="Calibri" w:eastAsia="Times New Roman" w:hAnsi="Calibri" w:cs="Calibri"/>
-                <w:color w:val="1A1A1A"/>
-                <w:sz w:val="20"/>
-                <w:szCs w:val="20"/>
-              </w:rPr>
-            </w:pPr>
-            <w:r>
-              <w:rPr>
-                <w:rFonts w:ascii="Calibri" w:eastAsia="Times New Roman" w:hAnsi="Calibri" w:cs="Calibri"/>
-                <w:color w:val="1A1A1A"/>
-                <w:sz w:val="20"/>
-                <w:szCs w:val="20"/>
-              </w:rPr>
-              <w:t>membro@acme.dev</w:t>
-            </w:r>
-          </w:p>
-        </w:tc>
-        <w:tc>
-          <w:tcPr>
-            <w:tcW w:w="0" w:type="auto"/>
-            <w:tcBorders>
-              <w:top w:val="single" w:sz="6" w:space="0" w:color="D8DEE9"/>
-              <w:left w:val="single" w:sz="6" w:space="0" w:color="D8DEE9"/>
-              <w:bottom w:val="single" w:sz="6" w:space="0" w:color="D8DEE9"/>
-              <w:right w:val="single" w:sz="6" w:space="0" w:color="D8DEE9"/>
-            </w:tcBorders>
-            <w:tcMar>
-              <w:top w:w="120" w:type="dxa"/>
-              <w:left w:w="120" w:type="dxa"/>
-              <w:bottom w:w="120" w:type="dxa"/>
-              <w:right w:w="120" w:type="dxa"/>
-            </w:tcMar>
-            <w:hideMark/>
-          </w:tcPr>
-          <w:p>
-            <w:pPr>
-              <w:spacing w:before="160" w:after="240"/>
-              <w:rPr>
-                <w:rFonts w:ascii="Calibri" w:eastAsia="Times New Roman" w:hAnsi="Calibri" w:cs="Calibri"/>
-                <w:color w:val="1A1A1A"/>
-                <w:sz w:val="20"/>
-                <w:szCs w:val="20"/>
-              </w:rPr>
-            </w:pPr>
-            <w:r>
-              <w:rPr>
-                <w:rFonts w:ascii="Calibri" w:eastAsia="Times New Roman" w:hAnsi="Calibri" w:cs="Calibri"/>
-                <w:color w:val="1A1A1A"/>
-                <w:sz w:val="20"/>
-                <w:szCs w:val="20"/>
-              </w:rPr>
-              <w:t>prancheto-dev-2026</w:t>
-            </w:r>
-          </w:p>
-        </w:tc>
-        <w:tc>
-          <w:tcPr>
-            <w:tcW w:w="0" w:type="auto"/>
-            <w:tcBorders>
-              <w:top w:val="single" w:sz="6" w:space="0" w:color="D8DEE9"/>
-              <w:left w:val="single" w:sz="6" w:space="0" w:color="D8DEE9"/>
-              <w:bottom w:val="single" w:sz="6" w:space="0" w:color="D8DEE9"/>
-              <w:right w:val="single" w:sz="6" w:space="0" w:color="D8DEE9"/>
-            </w:tcBorders>
-            <w:tcMar>
-              <w:top w:w="120" w:type="dxa"/>
-              <w:left w:w="120" w:type="dxa"/>
-              <w:bottom w:w="120" w:type="dxa"/>
-              <w:right w:w="120" w:type="dxa"/>
-            </w:tcMar>
-            <w:hideMark/>
-          </w:tcPr>
-          <w:p>
-            <w:pPr>
-              <w:spacing w:before="160" w:after="240"/>
-              <w:rPr>
-                <w:rFonts w:ascii="Calibri" w:eastAsia="Times New Roman" w:hAnsi="Calibri" w:cs="Calibri"/>
-                <w:color w:val="1A1A1A"/>
-                <w:sz w:val="20"/>
-                <w:szCs w:val="20"/>
-              </w:rPr>
-            </w:pPr>
-            <w:proofErr w:type="spellStart"/>
-            <w:r>
-              <w:rPr>
-                <w:rFonts w:ascii="Calibri" w:eastAsia="Times New Roman" w:hAnsi="Calibri" w:cs="Calibri"/>
-                <w:color w:val="1A1A1A"/>
-                <w:sz w:val="20"/>
-                <w:szCs w:val="20"/>
-              </w:rPr>
-              <w:t>Membro</w:t>
-            </w:r>
-            <w:proofErr w:type="spellEnd"/>
-            <w:r>
-              <w:rPr>
-                <w:rFonts w:ascii="Calibri" w:eastAsia="Times New Roman" w:hAnsi="Calibri" w:cs="Calibri"/>
-                <w:color w:val="1A1A1A"/>
-                <w:sz w:val="20"/>
-                <w:szCs w:val="20"/>
-              </w:rPr>
-              <w:t xml:space="preserve"> de Time</w:t>
-            </w:r>
-          </w:p>
-        </w:tc>
-        <w:tc>
-          <w:tcPr>
-            <w:tcW w:w="0" w:type="auto"/>
-            <w:tcBorders>
-              <w:top w:val="single" w:sz="6" w:space="0" w:color="D8DEE9"/>
-              <w:left w:val="single" w:sz="6" w:space="0" w:color="D8DEE9"/>
-              <w:bottom w:val="single" w:sz="6" w:space="0" w:color="D8DEE9"/>
-              <w:right w:val="single" w:sz="6" w:space="0" w:color="D8DEE9"/>
-            </w:tcBorders>
-            <w:tcMar>
-              <w:top w:w="120" w:type="dxa"/>
-              <w:left w:w="120" w:type="dxa"/>
-              <w:bottom w:w="120" w:type="dxa"/>
-              <w:right w:w="120" w:type="dxa"/>
-            </w:tcMar>
-            <w:hideMark/>
-          </w:tcPr>
-          <w:p>
-            <w:pPr>
-              <w:spacing w:before="160" w:after="240"/>
-              <w:rPr>
-                <w:rFonts w:ascii="Calibri" w:eastAsia="Times New Roman" w:hAnsi="Calibri" w:cs="Calibri"/>
-                <w:color w:val="1A1A1A"/>
-                <w:sz w:val="20"/>
-                <w:szCs w:val="20"/>
                 <w:lang w:val="pt-BR"/>
               </w:rPr>
             </w:pPr>
@@ -1474,49 +1472,170 @@
     <w:p>
       <w:pPr>
         <w:pStyle w:val="Ttulo1"/>
-      </w:pPr>
-      <w:r>
+        <w:rPr>
+          <w:lang w:val="pt-BR"/>
+        </w:rPr>
+      </w:pPr>
+      <w:r>
+        <w:rPr>
+          <w:lang w:val="pt-BR"/>
+        </w:rPr>
         <w:t>O que testar — Blocos 1 a 5</w:t>
       </w:r>
     </w:p>
     <w:p>
       <w:pPr>
         <w:pStyle w:val="sub"/>
-      </w:pPr>
-      <w:r>
-        <w:t>Mudanças recentes mergeadas em produção. Testar primeiro em desenvolvimento.</w:t>
+        <w:rPr>
+          <w:lang w:val="pt-BR"/>
+        </w:rPr>
+      </w:pPr>
+      <w:r>
+        <w:rPr>
+          <w:lang w:val="pt-BR"/>
+        </w:rPr>
+        <w:t xml:space="preserve">Mudanças recentes </w:t>
+      </w:r>
+      <w:proofErr w:type="spellStart"/>
+      <w:r>
+        <w:rPr>
+          <w:lang w:val="pt-BR"/>
+        </w:rPr>
+        <w:t>mergeadas</w:t>
+      </w:r>
+      <w:proofErr w:type="spellEnd"/>
+      <w:r>
+        <w:rPr>
+          <w:lang w:val="pt-BR"/>
+        </w:rPr>
+        <w:t xml:space="preserve"> em produção. Testar primeiro em desenvolvimento.</w:t>
       </w:r>
     </w:p>
     <w:p>
       <w:pPr>
         <w:pStyle w:val="Ttulo2"/>
-      </w:pPr>
-      <w:r>
+        <w:rPr>
+          <w:lang w:val="pt-BR"/>
+        </w:rPr>
+      </w:pPr>
+      <w:r>
+        <w:rPr>
+          <w:lang w:val="pt-BR"/>
+        </w:rPr>
         <w:t>Ambiente de teste</w:t>
       </w:r>
     </w:p>
     <w:p>
       <w:pPr>
         <w:pStyle w:val="NormalWeb"/>
-      </w:pPr>
-      <w:r>
+        <w:rPr>
+          <w:lang w:val="pt-BR"/>
+        </w:rPr>
+      </w:pPr>
+      <w:r>
+        <w:rPr>
+          <w:lang w:val="pt-BR"/>
+        </w:rPr>
         <w:t>Use o ambiente de desenvolvimento, não produção: https://prancheto-dev.vercel.app. Os dados são fictícios e o link pode ser compartilhado com quem for testar — produção guarda dados reais de clientes e não deve ser usada para teste.</w:t>
       </w:r>
     </w:p>
     <w:p>
       <w:pPr>
         <w:pStyle w:val="NormalWeb"/>
-      </w:pPr>
-      <w:r>
-        <w:t>Contas de teste (senha prancheto-dev-2026 para todas): admin@acme.dev (Líder Geral, vê tudo), gerente@acme.dev (Líder de Time) e membro@acme.dev (Membro de Time).</w:t>
+        <w:rPr>
+          <w:lang w:val="pt-BR"/>
+        </w:rPr>
+      </w:pPr>
+      <w:r>
+        <w:rPr>
+          <w:lang w:val="pt-BR"/>
+        </w:rPr>
+        <w:t xml:space="preserve">Contas de teste (senha prancheto-dev-2026 para todas): </w:t>
+      </w:r>
+      <w:proofErr w:type="spellStart"/>
+      <w:r>
+        <w:rPr>
+          <w:lang w:val="pt-BR"/>
+        </w:rPr>
+        <w:t>admin@acme.dev</w:t>
+      </w:r>
+      <w:proofErr w:type="spellEnd"/>
+      <w:r>
+        <w:rPr>
+          <w:lang w:val="pt-BR"/>
+        </w:rPr>
+        <w:t xml:space="preserve"> (Líder Geral, vê tudo), </w:t>
+      </w:r>
+      <w:proofErr w:type="spellStart"/>
+      <w:r>
+        <w:rPr>
+          <w:lang w:val="pt-BR"/>
+        </w:rPr>
+        <w:t>gerente@acme.dev</w:t>
+      </w:r>
+      <w:proofErr w:type="spellEnd"/>
+      <w:r>
+        <w:rPr>
+          <w:lang w:val="pt-BR"/>
+        </w:rPr>
+        <w:t xml:space="preserve"> (Líder de Time) e </w:t>
+      </w:r>
+      <w:proofErr w:type="spellStart"/>
+      <w:r>
+        <w:rPr>
+          <w:lang w:val="pt-BR"/>
+        </w:rPr>
+        <w:t>membro@acme.dev</w:t>
+      </w:r>
+      <w:proofErr w:type="spellEnd"/>
+      <w:r>
+        <w:rPr>
+          <w:lang w:val="pt-BR"/>
+        </w:rPr>
+        <w:t xml:space="preserve"> (Membro de Time).</w:t>
       </w:r>
     </w:p>
     <w:p>
       <w:pPr>
         <w:pStyle w:val="NormalWeb"/>
-      </w:pPr>
-      <w:r>
-        <w:t>Boa parte das mudanças deste ciclo é sobre permissão e hierarquia — teste a mesma ação com admin@acme.dev e com membro@acme.dev para comparar o que cada um consegue fazer.</w:t>
+        <w:rPr>
+          <w:lang w:val="pt-BR"/>
+        </w:rPr>
+      </w:pPr>
+      <w:r>
+        <w:rPr>
+          <w:lang w:val="pt-BR"/>
+        </w:rPr>
+        <w:lastRenderedPageBreak/>
+        <w:t xml:space="preserve">Boa parte das mudanças deste ciclo é sobre permissão e hierarquia — teste a mesma ação com </w:t>
+      </w:r>
+      <w:proofErr w:type="spellStart"/>
+      <w:r>
+        <w:rPr>
+          <w:lang w:val="pt-BR"/>
+        </w:rPr>
+        <w:t>admin@acme.dev</w:t>
+      </w:r>
+      <w:proofErr w:type="spellEnd"/>
+      <w:r>
+        <w:rPr>
+          <w:lang w:val="pt-BR"/>
+        </w:rPr>
+        <w:t xml:space="preserve"> e com </w:t>
+      </w:r>
+      <w:proofErr w:type="spellStart"/>
+      <w:r>
+        <w:rPr>
+          <w:lang w:val="pt-BR"/>
+        </w:rPr>
+        <w:t>membro@acme.dev</w:t>
+      </w:r>
+      <w:proofErr w:type="spellEnd"/>
+      <w:r>
+        <w:rPr>
+          <w:lang w:val="pt-BR"/>
+        </w:rPr>
+        <w:t xml:space="preserve"> para comparar o que cada um consegue fazer.</w:t>
       </w:r>
     </w:p>
     <w:p>
@@ -1544,51 +1663,15 @@
       </w:pPr>
       <w:r>
         <w:rPr>
-          <w:rFonts w:ascii="Calibri" w:eastAsia="Times New Roman" w:hAnsi="Calibri" w:cs="Calibri"/>
           <w:b/>
-          <w:bCs/>
-          <w:color w:val="1A1A1A"/>
-          <w:sz w:val="22"/>
-          <w:szCs w:val="22"/>
-          <w:lang w:val="pt-BR"/>
-        </w:rPr>
-      </w:r>
-      <w:r>
-        <w:rPr>
-          <w:rFonts w:ascii="Calibri" w:eastAsia="Times New Roman" w:hAnsi="Calibri" w:cs="Calibri"/>
-          <w:color w:val="1A1A1A"/>
-          <w:sz w:val="22"/>
-          <w:szCs w:val="22"/>
-          <w:lang w:val="pt-BR"/>
-        </w:rPr>
-      </w:r>
-      <w:proofErr w:type="spellStart"/>
-      <w:r>
-        <w:rPr>
-          <w:rFonts w:ascii="Calibri" w:eastAsia="Times New Roman" w:hAnsi="Calibri" w:cs="Calibri"/>
-          <w:color w:val="1A1A1A"/>
-          <w:sz w:val="22"/>
-          <w:szCs w:val="22"/>
-          <w:lang w:val="pt-BR"/>
-        </w:rPr>
-      </w:r>
-      <w:proofErr w:type="spellEnd"/>
-      <w:r>
-        <w:rPr>
-          <w:rFonts w:ascii="Calibri" w:eastAsia="Times New Roman" w:hAnsi="Calibri" w:cs="Calibri"/>
-          <w:color w:val="1A1A1A"/>
-          <w:sz w:val="22"/>
-          <w:szCs w:val="22"/>
-          <w:lang w:val="pt-BR"/>
-        </w:rPr>
-      </w:r>
-      <w:r>
-        <w:rPr>
-          <w:b/>
+          <w:lang w:val="pt-BR"/>
         </w:rPr>
         <w:t>Rótulos de status do Outbound</w:t>
       </w:r>
       <w:r>
+        <w:rPr>
+          <w:lang w:val="pt-BR"/>
+        </w:rPr>
         <w:t xml:space="preserve"> — cada usuário pode personalizar os rótulos das etapas; confirme que a personalização é por usuário, não global</w:t>
       </w:r>
     </w:p>
@@ -1609,51 +1692,15 @@
       </w:pPr>
       <w:r>
         <w:rPr>
-          <w:rFonts w:ascii="Calibri" w:eastAsia="Times New Roman" w:hAnsi="Calibri" w:cs="Calibri"/>
           <w:b/>
-          <w:bCs/>
-          <w:color w:val="1A1A1A"/>
-          <w:sz w:val="22"/>
-          <w:szCs w:val="22"/>
-          <w:lang w:val="pt-BR"/>
-        </w:rPr>
-      </w:r>
-      <w:r>
-        <w:rPr>
-          <w:rFonts w:ascii="Calibri" w:eastAsia="Times New Roman" w:hAnsi="Calibri" w:cs="Calibri"/>
-          <w:color w:val="1A1A1A"/>
-          <w:sz w:val="22"/>
-          <w:szCs w:val="22"/>
-          <w:lang w:val="pt-BR"/>
-        </w:rPr>
-      </w:r>
-      <w:proofErr w:type="spellStart"/>
-      <w:r>
-        <w:rPr>
-          <w:rFonts w:ascii="Calibri" w:eastAsia="Times New Roman" w:hAnsi="Calibri" w:cs="Calibri"/>
-          <w:color w:val="1A1A1A"/>
-          <w:sz w:val="22"/>
-          <w:szCs w:val="22"/>
-          <w:lang w:val="pt-BR"/>
-        </w:rPr>
-      </w:r>
-      <w:proofErr w:type="spellEnd"/>
-      <w:r>
-        <w:rPr>
-          <w:rFonts w:ascii="Calibri" w:eastAsia="Times New Roman" w:hAnsi="Calibri" w:cs="Calibri"/>
-          <w:color w:val="1A1A1A"/>
-          <w:sz w:val="22"/>
-          <w:szCs w:val="22"/>
-          <w:lang w:val="pt-BR"/>
-        </w:rPr>
-      </w:r>
-      <w:r>
-        <w:rPr>
-          <w:b/>
+          <w:lang w:val="pt-BR"/>
         </w:rPr>
         <w:t>Campos de negócio/empresa no CRM</w:t>
       </w:r>
       <w:r>
+        <w:rPr>
+          <w:lang w:val="pt-BR"/>
+        </w:rPr>
         <w:t xml:space="preserve"> — abra um contato em CRM e confira os novos campos (negócio e empresa) ao criar e editar</w:t>
       </w:r>
     </w:p>
@@ -1674,51 +1721,15 @@
       </w:pPr>
       <w:r>
         <w:rPr>
-          <w:rFonts w:ascii="Calibri" w:eastAsia="Times New Roman" w:hAnsi="Calibri" w:cs="Calibri"/>
           <w:b/>
-          <w:bCs/>
-          <w:color w:val="1A1A1A"/>
-          <w:sz w:val="22"/>
-          <w:szCs w:val="22"/>
-          <w:lang w:val="pt-BR"/>
-        </w:rPr>
-      </w:r>
-      <w:r>
-        <w:rPr>
-          <w:rFonts w:ascii="Calibri" w:eastAsia="Times New Roman" w:hAnsi="Calibri" w:cs="Calibri"/>
-          <w:color w:val="1A1A1A"/>
-          <w:sz w:val="22"/>
-          <w:szCs w:val="22"/>
-          <w:lang w:val="pt-BR"/>
-        </w:rPr>
-      </w:r>
-      <w:proofErr w:type="spellStart"/>
-      <w:r>
-        <w:rPr>
-          <w:rFonts w:ascii="Calibri" w:eastAsia="Times New Roman" w:hAnsi="Calibri" w:cs="Calibri"/>
-          <w:color w:val="1A1A1A"/>
-          <w:sz w:val="22"/>
-          <w:szCs w:val="22"/>
-          <w:lang w:val="pt-BR"/>
-        </w:rPr>
-      </w:r>
-      <w:proofErr w:type="spellEnd"/>
-      <w:r>
-        <w:rPr>
-          <w:rFonts w:ascii="Calibri" w:eastAsia="Times New Roman" w:hAnsi="Calibri" w:cs="Calibri"/>
-          <w:color w:val="1A1A1A"/>
-          <w:sz w:val="22"/>
-          <w:szCs w:val="22"/>
-          <w:lang w:val="pt-BR"/>
-        </w:rPr>
-      </w:r>
-      <w:r>
-        <w:rPr>
-          <w:b/>
+          <w:lang w:val="pt-BR"/>
         </w:rPr>
         <w:t>Sincronização Outbound ↔ CRM</w:t>
       </w:r>
       <w:r>
+        <w:rPr>
+          <w:lang w:val="pt-BR"/>
+        </w:rPr>
         <w:t xml:space="preserve"> — mova um contato de etapa no Outbound e confira se o funil do CRM reflete a mudança automaticamente, e vice-versa</w:t>
       </w:r>
     </w:p>
@@ -1739,60 +1750,44 @@
       </w:pPr>
       <w:r>
         <w:rPr>
-          <w:rFonts w:ascii="Calibri" w:eastAsia="Times New Roman" w:hAnsi="Calibri" w:cs="Calibri"/>
           <w:b/>
-          <w:bCs/>
-          <w:color w:val="1A1A1A"/>
-          <w:sz w:val="22"/>
-          <w:szCs w:val="22"/>
-          <w:lang w:val="pt-BR"/>
-        </w:rPr>
-      </w:r>
-      <w:r>
-        <w:rPr>
-          <w:rFonts w:ascii="Calibri" w:eastAsia="Times New Roman" w:hAnsi="Calibri" w:cs="Calibri"/>
-          <w:color w:val="1A1A1A"/>
-          <w:sz w:val="22"/>
-          <w:szCs w:val="22"/>
-          <w:lang w:val="pt-BR"/>
-        </w:rPr>
-      </w:r>
-      <w:proofErr w:type="spellStart"/>
-      <w:r>
-        <w:rPr>
-          <w:rFonts w:ascii="Calibri" w:eastAsia="Times New Roman" w:hAnsi="Calibri" w:cs="Calibri"/>
-          <w:color w:val="1A1A1A"/>
-          <w:sz w:val="22"/>
-          <w:szCs w:val="22"/>
-          <w:lang w:val="pt-BR"/>
-        </w:rPr>
-      </w:r>
-      <w:proofErr w:type="spellEnd"/>
-      <w:r>
-        <w:rPr>
-          <w:rFonts w:ascii="Calibri" w:eastAsia="Times New Roman" w:hAnsi="Calibri" w:cs="Calibri"/>
-          <w:color w:val="1A1A1A"/>
-          <w:sz w:val="22"/>
-          <w:szCs w:val="22"/>
-          <w:lang w:val="pt-BR"/>
-        </w:rPr>
-      </w:r>
-      <w:r>
-        <w:rPr>
-          <w:b/>
+          <w:lang w:val="pt-BR"/>
         </w:rPr>
         <w:t>Contadores agregados</w:t>
       </w:r>
       <w:r>
+        <w:rPr>
+          <w:lang w:val="pt-BR"/>
+        </w:rPr>
         <w:t xml:space="preserve"> — os totais exibidos no Outbound e no CRM devem bater com a quantidade real de itens em cada etapa</w:t>
       </w:r>
     </w:p>
     <w:p>
       <w:pPr>
         <w:pStyle w:val="Ttulo2"/>
-      </w:pPr>
-      <w:r>
-        <w:t>Bloco 2 — Sidebar e Chat IA flutuante</w:t>
+        <w:rPr>
+          <w:lang w:val="pt-BR"/>
+        </w:rPr>
+      </w:pPr>
+      <w:r>
+        <w:rPr>
+          <w:lang w:val="pt-BR"/>
+        </w:rPr>
+        <w:t xml:space="preserve">Bloco 2 — </w:t>
+      </w:r>
+      <w:proofErr w:type="spellStart"/>
+      <w:r>
+        <w:rPr>
+          <w:lang w:val="pt-BR"/>
+        </w:rPr>
+        <w:t>Sidebar</w:t>
+      </w:r>
+      <w:proofErr w:type="spellEnd"/>
+      <w:r>
+        <w:rPr>
+          <w:lang w:val="pt-BR"/>
+        </w:rPr>
+        <w:t xml:space="preserve"> e Chat IA flutuante</w:t>
       </w:r>
     </w:p>
     <w:p>
@@ -1812,51 +1807,24 @@
       </w:pPr>
       <w:r>
         <w:rPr>
-          <w:rFonts w:ascii="Calibri" w:eastAsia="Times New Roman" w:hAnsi="Calibri" w:cs="Calibri"/>
           <w:b/>
-          <w:bCs/>
-          <w:color w:val="1A1A1A"/>
-          <w:sz w:val="22"/>
-          <w:szCs w:val="22"/>
-          <w:lang w:val="pt-BR"/>
-        </w:rPr>
-      </w:r>
-      <w:r>
-        <w:rPr>
-          <w:rFonts w:ascii="Calibri" w:eastAsia="Times New Roman" w:hAnsi="Calibri" w:cs="Calibri"/>
-          <w:color w:val="1A1A1A"/>
-          <w:sz w:val="22"/>
-          <w:szCs w:val="22"/>
-          <w:lang w:val="pt-BR"/>
-        </w:rPr>
+          <w:lang w:val="pt-BR"/>
+        </w:rPr>
+        <w:t xml:space="preserve">Recolher/expandir a </w:t>
       </w:r>
       <w:proofErr w:type="spellStart"/>
       <w:r>
         <w:rPr>
-          <w:rFonts w:ascii="Calibri" w:eastAsia="Times New Roman" w:hAnsi="Calibri" w:cs="Calibri"/>
-          <w:color w:val="1A1A1A"/>
-          <w:sz w:val="22"/>
-          <w:szCs w:val="22"/>
-          <w:lang w:val="pt-BR"/>
-        </w:rPr>
+          <w:b/>
+          <w:lang w:val="pt-BR"/>
+        </w:rPr>
+        <w:t>sidebar</w:t>
       </w:r>
       <w:proofErr w:type="spellEnd"/>
       <w:r>
         <w:rPr>
-          <w:rFonts w:ascii="Calibri" w:eastAsia="Times New Roman" w:hAnsi="Calibri" w:cs="Calibri"/>
-          <w:color w:val="1A1A1A"/>
-          <w:sz w:val="22"/>
-          <w:szCs w:val="22"/>
-          <w:lang w:val="pt-BR"/>
-        </w:rPr>
-      </w:r>
-      <w:r>
-        <w:rPr>
-          <w:b/>
-        </w:rPr>
-        <w:t>Recolher/expandir a sidebar</w:t>
-      </w:r>
-      <w:r>
+          <w:lang w:val="pt-BR"/>
+        </w:rPr>
         <w:t xml:space="preserve"> — o botão deve colapsar a barra lateral e manter a preferência ao recarregar a página</w:t>
       </w:r>
     </w:p>
@@ -1877,53 +1845,39 @@
       </w:pPr>
       <w:r>
         <w:rPr>
-          <w:rFonts w:ascii="Calibri" w:eastAsia="Times New Roman" w:hAnsi="Calibri" w:cs="Calibri"/>
           <w:b/>
-          <w:bCs/>
-          <w:color w:val="1A1A1A"/>
-          <w:sz w:val="22"/>
-          <w:szCs w:val="22"/>
-          <w:lang w:val="pt-BR"/>
-        </w:rPr>
-      </w:r>
-      <w:r>
-        <w:rPr>
-          <w:rFonts w:ascii="Calibri" w:eastAsia="Times New Roman" w:hAnsi="Calibri" w:cs="Calibri"/>
-          <w:color w:val="1A1A1A"/>
-          <w:sz w:val="22"/>
-          <w:szCs w:val="22"/>
-          <w:lang w:val="pt-BR"/>
-        </w:rPr>
+          <w:lang w:val="pt-BR"/>
+        </w:rPr>
+        <w:t>Bolinha flutuante do Chat IA</w:t>
+      </w:r>
+      <w:r>
+        <w:rPr>
+          <w:lang w:val="pt-BR"/>
+        </w:rPr>
+        <w:t xml:space="preserve"> — arraste a bolinha pela tela; teste também a opção de </w:t>
+      </w:r>
+      <w:proofErr w:type="gramStart"/>
+      <w:r>
+        <w:rPr>
+          <w:lang w:val="pt-BR"/>
+        </w:rPr>
+        <w:t>fixá-la</w:t>
+      </w:r>
+      <w:proofErr w:type="gramEnd"/>
+      <w:r>
+        <w:rPr>
+          <w:lang w:val="pt-BR"/>
+        </w:rPr>
+        <w:t xml:space="preserve"> como item comum da </w:t>
       </w:r>
       <w:proofErr w:type="spellStart"/>
       <w:r>
         <w:rPr>
-          <w:rFonts w:ascii="Calibri" w:eastAsia="Times New Roman" w:hAnsi="Calibri" w:cs="Calibri"/>
-          <w:color w:val="1A1A1A"/>
-          <w:sz w:val="22"/>
-          <w:szCs w:val="22"/>
-          <w:lang w:val="pt-BR"/>
-        </w:rPr>
+          <w:lang w:val="pt-BR"/>
+        </w:rPr>
+        <w:t>sidebar</w:t>
       </w:r>
       <w:proofErr w:type="spellEnd"/>
-      <w:r>
-        <w:rPr>
-          <w:rFonts w:ascii="Calibri" w:eastAsia="Times New Roman" w:hAnsi="Calibri" w:cs="Calibri"/>
-          <w:color w:val="1A1A1A"/>
-          <w:sz w:val="22"/>
-          <w:szCs w:val="22"/>
-          <w:lang w:val="pt-BR"/>
-        </w:rPr>
-      </w:r>
-      <w:r>
-        <w:rPr>
-          <w:b/>
-        </w:rPr>
-        <w:t>Bolinha flutuante do Chat IA</w:t>
-      </w:r>
-      <w:r>
-        <w:t xml:space="preserve"> — arraste a bolinha pela tela; teste também a opção de fixá-la como item comum da sidebar</w:t>
-      </w:r>
     </w:p>
     <w:p>
       <w:pPr>
@@ -1950,51 +1904,15 @@
       </w:pPr>
       <w:r>
         <w:rPr>
-          <w:rFonts w:ascii="Calibri" w:eastAsia="Times New Roman" w:hAnsi="Calibri" w:cs="Calibri"/>
           <w:b/>
-          <w:bCs/>
-          <w:color w:val="1A1A1A"/>
-          <w:sz w:val="22"/>
-          <w:szCs w:val="22"/>
-          <w:lang w:val="pt-BR"/>
-        </w:rPr>
-      </w:r>
-      <w:r>
-        <w:rPr>
-          <w:rFonts w:ascii="Calibri" w:eastAsia="Times New Roman" w:hAnsi="Calibri" w:cs="Calibri"/>
-          <w:color w:val="1A1A1A"/>
-          <w:sz w:val="22"/>
-          <w:szCs w:val="22"/>
-          <w:lang w:val="pt-BR"/>
-        </w:rPr>
-      </w:r>
-      <w:proofErr w:type="spellStart"/>
-      <w:r>
-        <w:rPr>
-          <w:rFonts w:ascii="Calibri" w:eastAsia="Times New Roman" w:hAnsi="Calibri" w:cs="Calibri"/>
-          <w:color w:val="1A1A1A"/>
-          <w:sz w:val="22"/>
-          <w:szCs w:val="22"/>
-          <w:lang w:val="pt-BR"/>
-        </w:rPr>
-      </w:r>
-      <w:proofErr w:type="spellEnd"/>
-      <w:r>
-        <w:rPr>
-          <w:rFonts w:ascii="Calibri" w:eastAsia="Times New Roman" w:hAnsi="Calibri" w:cs="Calibri"/>
-          <w:color w:val="1A1A1A"/>
-          <w:sz w:val="22"/>
-          <w:szCs w:val="22"/>
-          <w:lang w:val="pt-BR"/>
-        </w:rPr>
-      </w:r>
-      <w:r>
-        <w:rPr>
-          <w:b/>
+          <w:lang w:val="pt-BR"/>
         </w:rPr>
         <w:t>Tela de Início</w:t>
       </w:r>
       <w:r>
+        <w:rPr>
+          <w:lang w:val="pt-BR"/>
+        </w:rPr>
         <w:t xml:space="preserve"> — agora é um painel de widgets: Mini Agenda, Mural de Anúncios, Acessos Rápidos, Minhas Tarefas e Leads Quentes</w:t>
       </w:r>
     </w:p>
@@ -2015,51 +1933,15 @@
       </w:pPr>
       <w:r>
         <w:rPr>
-          <w:rFonts w:ascii="Calibri" w:eastAsia="Times New Roman" w:hAnsi="Calibri" w:cs="Calibri"/>
           <w:b/>
-          <w:bCs/>
-          <w:color w:val="1A1A1A"/>
-          <w:sz w:val="22"/>
-          <w:szCs w:val="22"/>
-          <w:lang w:val="pt-BR"/>
-        </w:rPr>
-      </w:r>
-      <w:r>
-        <w:rPr>
-          <w:rFonts w:ascii="Calibri" w:eastAsia="Times New Roman" w:hAnsi="Calibri" w:cs="Calibri"/>
-          <w:color w:val="1A1A1A"/>
-          <w:sz w:val="22"/>
-          <w:szCs w:val="22"/>
-          <w:lang w:val="pt-BR"/>
-        </w:rPr>
-      </w:r>
-      <w:proofErr w:type="spellStart"/>
-      <w:r>
-        <w:rPr>
-          <w:rFonts w:ascii="Calibri" w:eastAsia="Times New Roman" w:hAnsi="Calibri" w:cs="Calibri"/>
-          <w:color w:val="1A1A1A"/>
-          <w:sz w:val="22"/>
-          <w:szCs w:val="22"/>
-          <w:lang w:val="pt-BR"/>
-        </w:rPr>
-      </w:r>
-      <w:proofErr w:type="spellEnd"/>
-      <w:r>
-        <w:rPr>
-          <w:rFonts w:ascii="Calibri" w:eastAsia="Times New Roman" w:hAnsi="Calibri" w:cs="Calibri"/>
-          <w:color w:val="1A1A1A"/>
-          <w:sz w:val="22"/>
-          <w:szCs w:val="22"/>
-          <w:lang w:val="pt-BR"/>
-        </w:rPr>
-      </w:r>
-      <w:r>
-        <w:rPr>
-          <w:b/>
+          <w:lang w:val="pt-BR"/>
         </w:rPr>
         <w:t>Personalização da Home</w:t>
       </w:r>
       <w:r>
+        <w:rPr>
+          <w:lang w:val="pt-BR"/>
+        </w:rPr>
         <w:t xml:space="preserve"> — adicione, remova e reorganize widgets; saia e entre novamente para confirmar que a personalização persiste por usuário</w:t>
       </w:r>
     </w:p>
@@ -2080,41 +1962,12 @@
       </w:pPr>
       <w:r>
         <w:rPr>
-          <w:rFonts w:ascii="Calibri" w:eastAsia="Times New Roman" w:hAnsi="Calibri" w:cs="Calibri"/>
           <w:b/>
-          <w:bCs/>
-          <w:color w:val="1A1A1A"/>
-          <w:sz w:val="22"/>
-          <w:szCs w:val="22"/>
-          <w:lang w:val="pt-BR"/>
-        </w:rPr>
-      </w:r>
-      <w:r>
-        <w:rPr>
-          <w:rFonts w:ascii="Calibri" w:eastAsia="Times New Roman" w:hAnsi="Calibri" w:cs="Calibri"/>
-          <w:color w:val="1A1A1A"/>
-          <w:sz w:val="22"/>
-          <w:szCs w:val="22"/>
-          <w:lang w:val="pt-BR"/>
-        </w:rPr>
-      </w:r>
-      <w:proofErr w:type="spellStart"/>
-      <w:r>
-        <w:rPr>
-          <w:rFonts w:ascii="Calibri" w:eastAsia="Times New Roman" w:hAnsi="Calibri" w:cs="Calibri"/>
-          <w:color w:val="1A1A1A"/>
-          <w:sz w:val="22"/>
-          <w:szCs w:val="22"/>
-          <w:lang w:val="pt-BR"/>
-        </w:rPr>
-      </w:r>
-      <w:proofErr w:type="spellEnd"/>
-      <w:r>
-        <w:rPr>
-          <w:rFonts w:ascii="Calibri" w:eastAsia="Times New Roman" w:hAnsi="Calibri" w:cs="Calibri"/>
-          <w:color w:val="1A1A1A"/>
-          <w:sz w:val="22"/>
-          <w:szCs w:val="22"/>
+          <w:lang w:val="pt-BR"/>
+        </w:rPr>
+      </w:r>
+      <w:r>
+        <w:rPr>
           <w:lang w:val="pt-BR"/>
         </w:rPr>
       </w:r>
@@ -2122,18 +1975,10 @@
         <w:rPr>
           <w:b/>
         </w:rPr>
-        <w:t>Mural de Anúncios</w:t>
-      </w:r>
-      <w:r>
-        <w:t xml:space="preserve"> — reaproveita o antigo Feed — confira se posts antigos do Feed aparecem aqui</w:t>
-      </w:r>
-    </w:p>
-    <w:p>
-      <w:pPr>
-        <w:pStyle w:val="Ttulo2"/>
-      </w:pPr>
-      <w:r>
-        <w:t>Bloco 4 — Fim do hub /modulos</w:t>
+        <w:t>Leads Quentes vem oculto por padrão</w:t>
+      </w:r>
+      <w:r>
+        <w:t xml:space="preserve"> — não é bug: os 5 widgets existem, mas só 4 aparecem de início. Para ver Leads Quentes, abra "Personalizar" e clique em "Mostrar" ao lado dele (também dá pra reordenar arrastando e ocultar os demais).</w:t>
       </w:r>
     </w:p>
     <w:p>
@@ -2153,52 +1998,24 @@
       </w:pPr>
       <w:r>
         <w:rPr>
-          <w:rFonts w:ascii="Calibri" w:eastAsia="Times New Roman" w:hAnsi="Calibri" w:cs="Calibri"/>
           <w:b/>
-          <w:bCs/>
-          <w:color w:val="1A1A1A"/>
-          <w:sz w:val="22"/>
-          <w:szCs w:val="22"/>
-          <w:lang w:val="pt-BR"/>
-        </w:rPr>
-      </w:r>
-      <w:r>
-        <w:rPr>
-          <w:rFonts w:ascii="Calibri" w:eastAsia="Times New Roman" w:hAnsi="Calibri" w:cs="Calibri"/>
-          <w:color w:val="1A1A1A"/>
-          <w:sz w:val="22"/>
-          <w:szCs w:val="22"/>
-          <w:lang w:val="pt-BR"/>
-        </w:rPr>
-      </w:r>
-      <w:proofErr w:type="spellStart"/>
-      <w:r>
-        <w:rPr>
-          <w:rFonts w:ascii="Calibri" w:eastAsia="Times New Roman" w:hAnsi="Calibri" w:cs="Calibri"/>
-          <w:color w:val="1A1A1A"/>
-          <w:sz w:val="22"/>
-          <w:szCs w:val="22"/>
-          <w:lang w:val="pt-BR"/>
-        </w:rPr>
-      </w:r>
-      <w:proofErr w:type="spellEnd"/>
-      <w:r>
-        <w:rPr>
-          <w:rFonts w:ascii="Calibri" w:eastAsia="Times New Roman" w:hAnsi="Calibri" w:cs="Calibri"/>
-          <w:color w:val="1A1A1A"/>
-          <w:sz w:val="22"/>
-          <w:szCs w:val="22"/>
-          <w:lang w:val="pt-BR"/>
-        </w:rPr>
-      </w:r>
-      <w:r>
-        <w:rPr>
-          <w:b/>
-        </w:rPr>
-        <w:t>Itens diretos na sidebar</w:t>
-      </w:r>
-      <w:r>
-        <w:t xml:space="preserve"> — Chat, Calendário, Projetos, Tarefas e Times e Pessoas saíram de dentro de /modulos e agora ficam na sidebar principal</w:t>
+          <w:lang w:val="pt-BR"/>
+        </w:rPr>
+        <w:t>Mural de Anúncios</w:t>
+      </w:r>
+      <w:r>
+        <w:rPr>
+          <w:lang w:val="pt-BR"/>
+        </w:rPr>
+        <w:t xml:space="preserve"> — reaproveita o antigo Feed — confira se posts antigos do Feed aparecem aqui</w:t>
+      </w:r>
+    </w:p>
+    <w:p>
+      <w:pPr>
+        <w:pStyle w:val="Ttulo2"/>
+      </w:pPr>
+      <w:r>
+        <w:t>Bloco 4 — Fim do hub /modulos</w:t>
       </w:r>
     </w:p>
     <w:p>
@@ -2218,52 +2035,53 @@
       </w:pPr>
       <w:r>
         <w:rPr>
-          <w:rFonts w:ascii="Calibri" w:eastAsia="Times New Roman" w:hAnsi="Calibri" w:cs="Calibri"/>
           <w:b/>
-          <w:bCs/>
-          <w:color w:val="1A1A1A"/>
-          <w:sz w:val="22"/>
-          <w:szCs w:val="22"/>
-          <w:lang w:val="pt-BR"/>
-        </w:rPr>
-      </w:r>
-      <w:r>
-        <w:rPr>
-          <w:rFonts w:ascii="Calibri" w:eastAsia="Times New Roman" w:hAnsi="Calibri" w:cs="Calibri"/>
-          <w:color w:val="1A1A1A"/>
-          <w:sz w:val="22"/>
-          <w:szCs w:val="22"/>
-          <w:lang w:val="pt-BR"/>
-        </w:rPr>
+          <w:lang w:val="pt-BR"/>
+        </w:rPr>
+        <w:t xml:space="preserve">Itens diretos na </w:t>
       </w:r>
       <w:proofErr w:type="spellStart"/>
       <w:r>
         <w:rPr>
-          <w:rFonts w:ascii="Calibri" w:eastAsia="Times New Roman" w:hAnsi="Calibri" w:cs="Calibri"/>
-          <w:color w:val="1A1A1A"/>
-          <w:sz w:val="22"/>
-          <w:szCs w:val="22"/>
-          <w:lang w:val="pt-BR"/>
-        </w:rPr>
+          <w:b/>
+          <w:lang w:val="pt-BR"/>
+        </w:rPr>
+        <w:t>sidebar</w:t>
       </w:r>
       <w:proofErr w:type="spellEnd"/>
       <w:r>
         <w:rPr>
-          <w:rFonts w:ascii="Calibri" w:eastAsia="Times New Roman" w:hAnsi="Calibri" w:cs="Calibri"/>
-          <w:color w:val="1A1A1A"/>
-          <w:sz w:val="22"/>
-          <w:szCs w:val="22"/>
-          <w:lang w:val="pt-BR"/>
-        </w:rPr>
-      </w:r>
-      <w:r>
-        <w:rPr>
-          <w:b/>
-        </w:rPr>
-        <w:t>Criação de canal de chat</w:t>
-      </w:r>
-      <w:r>
-        <w:t xml:space="preserve"> — bug de causa raiz corrigido — criar um canal novo deve funcionar sem erro</w:t>
+          <w:lang w:val="pt-BR"/>
+        </w:rPr>
+        <w:t xml:space="preserve"> — Chat, Calendário, Projetos, Tarefas e Times e Pessoas saíram de dentro de /</w:t>
+      </w:r>
+      <w:proofErr w:type="spellStart"/>
+      <w:r>
+        <w:rPr>
+          <w:lang w:val="pt-BR"/>
+        </w:rPr>
+        <w:t>modulos</w:t>
+      </w:r>
+      <w:proofErr w:type="spellEnd"/>
+      <w:r>
+        <w:rPr>
+          <w:lang w:val="pt-BR"/>
+        </w:rPr>
+        <w:t xml:space="preserve"> e agora ficam na </w:t>
+      </w:r>
+      <w:proofErr w:type="spellStart"/>
+      <w:r>
+        <w:rPr>
+          <w:lang w:val="pt-BR"/>
+        </w:rPr>
+        <w:t>sidebar</w:t>
+      </w:r>
+      <w:proofErr w:type="spellEnd"/>
+      <w:r>
+        <w:rPr>
+          <w:lang w:val="pt-BR"/>
+        </w:rPr>
+        <w:t xml:space="preserve"> principal</w:t>
       </w:r>
     </w:p>
     <w:p>
@@ -2283,52 +2101,16 @@
       </w:pPr>
       <w:r>
         <w:rPr>
-          <w:rFonts w:ascii="Calibri" w:eastAsia="Times New Roman" w:hAnsi="Calibri" w:cs="Calibri"/>
           <w:b/>
-          <w:bCs/>
-          <w:color w:val="1A1A1A"/>
-          <w:sz w:val="22"/>
-          <w:szCs w:val="22"/>
-          <w:lang w:val="pt-BR"/>
-        </w:rPr>
-      </w:r>
-      <w:r>
-        <w:rPr>
-          <w:rFonts w:ascii="Calibri" w:eastAsia="Times New Roman" w:hAnsi="Calibri" w:cs="Calibri"/>
-          <w:color w:val="1A1A1A"/>
-          <w:sz w:val="22"/>
-          <w:szCs w:val="22"/>
-          <w:lang w:val="pt-BR"/>
-        </w:rPr>
-      </w:r>
-      <w:proofErr w:type="spellStart"/>
-      <w:r>
-        <w:rPr>
-          <w:rFonts w:ascii="Calibri" w:eastAsia="Times New Roman" w:hAnsi="Calibri" w:cs="Calibri"/>
-          <w:color w:val="1A1A1A"/>
-          <w:sz w:val="22"/>
-          <w:szCs w:val="22"/>
-          <w:lang w:val="pt-BR"/>
-        </w:rPr>
-      </w:r>
-      <w:proofErr w:type="spellEnd"/>
-      <w:r>
-        <w:rPr>
-          <w:rFonts w:ascii="Calibri" w:eastAsia="Times New Roman" w:hAnsi="Calibri" w:cs="Calibri"/>
-          <w:color w:val="1A1A1A"/>
-          <w:sz w:val="22"/>
-          <w:szCs w:val="22"/>
-          <w:lang w:val="pt-BR"/>
-        </w:rPr>
-      </w:r>
-      <w:r>
-        <w:rPr>
-          <w:b/>
-        </w:rPr>
-        <w:t>Calendário</w:t>
-      </w:r>
-      <w:r>
-        <w:t xml:space="preserve"> — teste fuso horário dos eventos e o drag-and-drop para mudar data/hora</w:t>
+          <w:lang w:val="pt-BR"/>
+        </w:rPr>
+        <w:t>Criação de canal de chat</w:t>
+      </w:r>
+      <w:r>
+        <w:rPr>
+          <w:lang w:val="pt-BR"/>
+        </w:rPr>
+        <w:t xml:space="preserve"> — bug de causa raiz corrigido — criar um canal novo deve funcionar sem erro</w:t>
       </w:r>
     </w:p>
     <w:p>
@@ -2348,52 +2130,44 @@
       </w:pPr>
       <w:r>
         <w:rPr>
-          <w:rFonts w:ascii="Calibri" w:eastAsia="Times New Roman" w:hAnsi="Calibri" w:cs="Calibri"/>
           <w:b/>
-          <w:bCs/>
-          <w:color w:val="1A1A1A"/>
-          <w:sz w:val="22"/>
-          <w:szCs w:val="22"/>
-          <w:lang w:val="pt-BR"/>
-        </w:rPr>
-      </w:r>
-      <w:r>
-        <w:rPr>
-          <w:rFonts w:ascii="Calibri" w:eastAsia="Times New Roman" w:hAnsi="Calibri" w:cs="Calibri"/>
-          <w:color w:val="1A1A1A"/>
-          <w:sz w:val="22"/>
-          <w:szCs w:val="22"/>
-          <w:lang w:val="pt-BR"/>
-        </w:rPr>
+          <w:lang w:val="pt-BR"/>
+        </w:rPr>
+        <w:t>Calendário</w:t>
+      </w:r>
+      <w:r>
+        <w:rPr>
+          <w:lang w:val="pt-BR"/>
+        </w:rPr>
+        <w:t xml:space="preserve"> — teste fuso horário dos eventos e o drag-</w:t>
       </w:r>
       <w:proofErr w:type="spellStart"/>
       <w:r>
         <w:rPr>
-          <w:rFonts w:ascii="Calibri" w:eastAsia="Times New Roman" w:hAnsi="Calibri" w:cs="Calibri"/>
-          <w:color w:val="1A1A1A"/>
-          <w:sz w:val="22"/>
-          <w:szCs w:val="22"/>
-          <w:lang w:val="pt-BR"/>
-        </w:rPr>
+          <w:lang w:val="pt-BR"/>
+        </w:rPr>
+        <w:t>and</w:t>
       </w:r>
       <w:proofErr w:type="spellEnd"/>
       <w:r>
         <w:rPr>
-          <w:rFonts w:ascii="Calibri" w:eastAsia="Times New Roman" w:hAnsi="Calibri" w:cs="Calibri"/>
-          <w:color w:val="1A1A1A"/>
-          <w:sz w:val="22"/>
-          <w:szCs w:val="22"/>
-          <w:lang w:val="pt-BR"/>
-        </w:rPr>
-      </w:r>
-      <w:r>
-        <w:rPr>
-          <w:b/>
-        </w:rPr>
-        <w:t>Atribuição de tarefas</w:t>
-      </w:r>
-      <w:r>
-        <w:t xml:space="preserve"> — antes não era salva — atribua uma tarefa a alguém e confirme que o responsável persiste</w:t>
+          <w:lang w:val="pt-BR"/>
+        </w:rPr>
+        <w:t>-</w:t>
+      </w:r>
+      <w:proofErr w:type="spellStart"/>
+      <w:r>
+        <w:rPr>
+          <w:lang w:val="pt-BR"/>
+        </w:rPr>
+        <w:t>drop</w:t>
+      </w:r>
+      <w:proofErr w:type="spellEnd"/>
+      <w:r>
+        <w:rPr>
+          <w:lang w:val="pt-BR"/>
+        </w:rPr>
+        <w:t xml:space="preserve"> para mudar data/hora</w:t>
       </w:r>
     </w:p>
     <w:p>
@@ -2413,52 +2187,16 @@
       </w:pPr>
       <w:r>
         <w:rPr>
-          <w:rFonts w:ascii="Calibri" w:eastAsia="Times New Roman" w:hAnsi="Calibri" w:cs="Calibri"/>
           <w:b/>
-          <w:bCs/>
-          <w:color w:val="1A1A1A"/>
-          <w:sz w:val="22"/>
-          <w:szCs w:val="22"/>
-          <w:lang w:val="pt-BR"/>
-        </w:rPr>
-      </w:r>
-      <w:r>
-        <w:rPr>
-          <w:rFonts w:ascii="Calibri" w:eastAsia="Times New Roman" w:hAnsi="Calibri" w:cs="Calibri"/>
-          <w:color w:val="1A1A1A"/>
-          <w:sz w:val="22"/>
-          <w:szCs w:val="22"/>
-          <w:lang w:val="pt-BR"/>
-        </w:rPr>
-      </w:r>
-      <w:proofErr w:type="spellStart"/>
-      <w:r>
-        <w:rPr>
-          <w:rFonts w:ascii="Calibri" w:eastAsia="Times New Roman" w:hAnsi="Calibri" w:cs="Calibri"/>
-          <w:color w:val="1A1A1A"/>
-          <w:sz w:val="22"/>
-          <w:szCs w:val="22"/>
-          <w:lang w:val="pt-BR"/>
-        </w:rPr>
-      </w:r>
-      <w:proofErr w:type="spellEnd"/>
-      <w:r>
-        <w:rPr>
-          <w:rFonts w:ascii="Calibri" w:eastAsia="Times New Roman" w:hAnsi="Calibri" w:cs="Calibri"/>
-          <w:color w:val="1A1A1A"/>
-          <w:sz w:val="22"/>
-          <w:szCs w:val="22"/>
-          <w:lang w:val="pt-BR"/>
-        </w:rPr>
-      </w:r>
-      <w:r>
-        <w:rPr>
-          <w:b/>
-        </w:rPr>
-        <w:t>Membros de projeto</w:t>
-      </w:r>
-      <w:r>
-        <w:t xml:space="preserve"> — a gestão de membros dentro de um projeto estava ausente; teste adicionar e remover membros</w:t>
+          <w:lang w:val="pt-BR"/>
+        </w:rPr>
+        <w:t>Atribuição de tarefas</w:t>
+      </w:r>
+      <w:r>
+        <w:rPr>
+          <w:lang w:val="pt-BR"/>
+        </w:rPr>
+        <w:t xml:space="preserve"> — antes não era salva — atribua uma tarefa a alguém e confirme que o responsável persiste</w:t>
       </w:r>
     </w:p>
     <w:p>
@@ -2478,52 +2216,16 @@
       </w:pPr>
       <w:r>
         <w:rPr>
-          <w:rFonts w:ascii="Calibri" w:eastAsia="Times New Roman" w:hAnsi="Calibri" w:cs="Calibri"/>
           <w:b/>
-          <w:bCs/>
-          <w:color w:val="1A1A1A"/>
-          <w:sz w:val="22"/>
-          <w:szCs w:val="22"/>
-          <w:lang w:val="pt-BR"/>
-        </w:rPr>
-      </w:r>
-      <w:r>
-        <w:rPr>
-          <w:rFonts w:ascii="Calibri" w:eastAsia="Times New Roman" w:hAnsi="Calibri" w:cs="Calibri"/>
-          <w:color w:val="1A1A1A"/>
-          <w:sz w:val="22"/>
-          <w:szCs w:val="22"/>
-          <w:lang w:val="pt-BR"/>
-        </w:rPr>
-      </w:r>
-      <w:proofErr w:type="spellStart"/>
-      <w:r>
-        <w:rPr>
-          <w:rFonts w:ascii="Calibri" w:eastAsia="Times New Roman" w:hAnsi="Calibri" w:cs="Calibri"/>
-          <w:color w:val="1A1A1A"/>
-          <w:sz w:val="22"/>
-          <w:szCs w:val="22"/>
-          <w:lang w:val="pt-BR"/>
-        </w:rPr>
-      </w:r>
-      <w:proofErr w:type="spellEnd"/>
-      <w:r>
-        <w:rPr>
-          <w:rFonts w:ascii="Calibri" w:eastAsia="Times New Roman" w:hAnsi="Calibri" w:cs="Calibri"/>
-          <w:color w:val="1A1A1A"/>
-          <w:sz w:val="22"/>
-          <w:szCs w:val="22"/>
-          <w:lang w:val="pt-BR"/>
-        </w:rPr>
-      </w:r>
-      <w:r>
-        <w:rPr>
-          <w:b/>
-        </w:rPr>
-        <w:t>Times e Pessoas</w:t>
-      </w:r>
-      <w:r>
-        <w:t xml:space="preserve"> — trocou a chave interna usada para vincular membros ao time; confira se listagens e vínculos continuam corretos</w:t>
+          <w:lang w:val="pt-BR"/>
+        </w:rPr>
+        <w:t>Membros de projeto</w:t>
+      </w:r>
+      <w:r>
+        <w:rPr>
+          <w:lang w:val="pt-BR"/>
+        </w:rPr>
+        <w:t xml:space="preserve"> — a gestão de membros dentro de um projeto estava ausente; teste adicionar e remover membros</w:t>
       </w:r>
     </w:p>
     <w:p>
@@ -2543,60 +2245,31 @@
       </w:pPr>
       <w:r>
         <w:rPr>
-          <w:rFonts w:ascii="Calibri" w:eastAsia="Times New Roman" w:hAnsi="Calibri" w:cs="Calibri"/>
           <w:b/>
-          <w:bCs/>
-          <w:color w:val="1A1A1A"/>
-          <w:sz w:val="22"/>
-          <w:szCs w:val="22"/>
-          <w:lang w:val="pt-BR"/>
-        </w:rPr>
-      </w:r>
-      <w:r>
-        <w:rPr>
-          <w:rFonts w:ascii="Calibri" w:eastAsia="Times New Roman" w:hAnsi="Calibri" w:cs="Calibri"/>
-          <w:color w:val="1A1A1A"/>
-          <w:sz w:val="22"/>
-          <w:szCs w:val="22"/>
-          <w:lang w:val="pt-BR"/>
-        </w:rPr>
+          <w:lang w:val="pt-BR"/>
+        </w:rPr>
+        <w:lastRenderedPageBreak/>
+        <w:t>Times e Pessoas</w:t>
+      </w:r>
+      <w:r>
+        <w:rPr>
+          <w:lang w:val="pt-BR"/>
+        </w:rPr>
+        <w:t xml:space="preserve"> — trocou a chave interna usada para vincular membros ao time; confira </w:t>
       </w:r>
       <w:proofErr w:type="spellStart"/>
       <w:r>
         <w:rPr>
-          <w:rFonts w:ascii="Calibri" w:eastAsia="Times New Roman" w:hAnsi="Calibri" w:cs="Calibri"/>
-          <w:color w:val="1A1A1A"/>
-          <w:sz w:val="22"/>
-          <w:szCs w:val="22"/>
-          <w:lang w:val="pt-BR"/>
-        </w:rPr>
+          <w:lang w:val="pt-BR"/>
+        </w:rPr>
+        <w:t>se</w:t>
       </w:r>
       <w:proofErr w:type="spellEnd"/>
       <w:r>
         <w:rPr>
-          <w:rFonts w:ascii="Calibri" w:eastAsia="Times New Roman" w:hAnsi="Calibri" w:cs="Calibri"/>
-          <w:color w:val="1A1A1A"/>
-          <w:sz w:val="22"/>
-          <w:szCs w:val="22"/>
-          <w:lang w:val="pt-BR"/>
-        </w:rPr>
-      </w:r>
-      <w:r>
-        <w:rPr>
-          <w:b/>
-        </w:rPr>
-        <w:t>Grupos no Chat</w:t>
-      </w:r>
-      <w:r>
-        <w:t xml:space="preserve"> — chat em equipe agora suporta grupos com papéis de admin e membro; crie um grupo e teste as permissões de cada papel</w:t>
-      </w:r>
-    </w:p>
-    <w:p>
-      <w:pPr>
-        <w:pStyle w:val="Ttulo2"/>
-      </w:pPr>
-      <w:r>
-        <w:t>Bloco 5 — Hierarquia de usuários</w:t>
+          <w:lang w:val="pt-BR"/>
+        </w:rPr>
+        <w:t xml:space="preserve"> listagens e vínculos continuam corretos</w:t>
       </w:r>
     </w:p>
     <w:p>
@@ -2616,52 +2289,24 @@
       </w:pPr>
       <w:r>
         <w:rPr>
-          <w:rFonts w:ascii="Calibri" w:eastAsia="Times New Roman" w:hAnsi="Calibri" w:cs="Calibri"/>
           <w:b/>
-          <w:bCs/>
-          <w:color w:val="1A1A1A"/>
-          <w:sz w:val="22"/>
-          <w:szCs w:val="22"/>
-          <w:lang w:val="pt-BR"/>
-        </w:rPr>
-      </w:r>
-      <w:r>
-        <w:rPr>
-          <w:rFonts w:ascii="Calibri" w:eastAsia="Times New Roman" w:hAnsi="Calibri" w:cs="Calibri"/>
-          <w:color w:val="1A1A1A"/>
-          <w:sz w:val="22"/>
-          <w:szCs w:val="22"/>
-          <w:lang w:val="pt-BR"/>
-        </w:rPr>
-      </w:r>
-      <w:proofErr w:type="spellStart"/>
-      <w:r>
-        <w:rPr>
-          <w:rFonts w:ascii="Calibri" w:eastAsia="Times New Roman" w:hAnsi="Calibri" w:cs="Calibri"/>
-          <w:color w:val="1A1A1A"/>
-          <w:sz w:val="22"/>
-          <w:szCs w:val="22"/>
-          <w:lang w:val="pt-BR"/>
-        </w:rPr>
-      </w:r>
-      <w:proofErr w:type="spellEnd"/>
-      <w:r>
-        <w:rPr>
-          <w:rFonts w:ascii="Calibri" w:eastAsia="Times New Roman" w:hAnsi="Calibri" w:cs="Calibri"/>
-          <w:color w:val="1A1A1A"/>
-          <w:sz w:val="22"/>
-          <w:szCs w:val="22"/>
-          <w:lang w:val="pt-BR"/>
-        </w:rPr>
-      </w:r>
-      <w:r>
-        <w:rPr>
-          <w:b/>
-        </w:rPr>
-        <w:t>Chefe Supremo</w:t>
-      </w:r>
-      <w:r>
-        <w:t xml:space="preserve"> — o dono do tenant (quem criou a conta) deve ser intocável — outros usuários não podem editá-lo, desativá-lo ou remover seu cargo</w:t>
+          <w:lang w:val="pt-BR"/>
+        </w:rPr>
+        <w:t>Grupos no Chat</w:t>
+      </w:r>
+      <w:r>
+        <w:rPr>
+          <w:lang w:val="pt-BR"/>
+        </w:rPr>
+        <w:t xml:space="preserve"> — chat em equipe agora suporta grupos com papéis de admin e membro; crie um grupo e teste as permissões de cada papel</w:t>
+      </w:r>
+    </w:p>
+    <w:p>
+      <w:pPr>
+        <w:pStyle w:val="Ttulo2"/>
+      </w:pPr>
+      <w:r>
+        <w:t>Bloco 5 — Hierarquia de usuários</w:t>
       </w:r>
     </w:p>
     <w:p>
@@ -2681,52 +2326,30 @@
       </w:pPr>
       <w:r>
         <w:rPr>
-          <w:rFonts w:ascii="Calibri" w:eastAsia="Times New Roman" w:hAnsi="Calibri" w:cs="Calibri"/>
           <w:b/>
-          <w:bCs/>
-          <w:color w:val="1A1A1A"/>
-          <w:sz w:val="22"/>
-          <w:szCs w:val="22"/>
-          <w:lang w:val="pt-BR"/>
-        </w:rPr>
-      </w:r>
-      <w:r>
-        <w:rPr>
-          <w:rFonts w:ascii="Calibri" w:eastAsia="Times New Roman" w:hAnsi="Calibri" w:cs="Calibri"/>
-          <w:color w:val="1A1A1A"/>
-          <w:sz w:val="22"/>
-          <w:szCs w:val="22"/>
-          <w:lang w:val="pt-BR"/>
-        </w:rPr>
+          <w:lang w:val="pt-BR"/>
+        </w:rPr>
+        <w:t>Chefe Supremo</w:t>
+      </w:r>
+      <w:r>
+        <w:rPr>
+          <w:lang w:val="pt-BR"/>
+        </w:rPr>
+        <w:t xml:space="preserve"> — o dono do </w:t>
       </w:r>
       <w:proofErr w:type="spellStart"/>
       <w:r>
         <w:rPr>
-          <w:rFonts w:ascii="Calibri" w:eastAsia="Times New Roman" w:hAnsi="Calibri" w:cs="Calibri"/>
-          <w:color w:val="1A1A1A"/>
-          <w:sz w:val="22"/>
-          <w:szCs w:val="22"/>
-          <w:lang w:val="pt-BR"/>
-        </w:rPr>
+          <w:lang w:val="pt-BR"/>
+        </w:rPr>
+        <w:t>tenant</w:t>
       </w:r>
       <w:proofErr w:type="spellEnd"/>
       <w:r>
         <w:rPr>
-          <w:rFonts w:ascii="Calibri" w:eastAsia="Times New Roman" w:hAnsi="Calibri" w:cs="Calibri"/>
-          <w:color w:val="1A1A1A"/>
-          <w:sz w:val="22"/>
-          <w:szCs w:val="22"/>
-          <w:lang w:val="pt-BR"/>
-        </w:rPr>
-      </w:r>
-      <w:r>
-        <w:rPr>
-          <w:b/>
-        </w:rPr>
-        <w:t>Níveis hierárquicos em cargos</w:t>
-      </w:r>
-      <w:r>
-        <w:t xml:space="preserve"> — confira em Organização → Cargos se os níveis aparecem e se um cargo de nível mais baixo não consegue alterar um de nível mais alto</w:t>
+          <w:lang w:val="pt-BR"/>
+        </w:rPr>
+        <w:t xml:space="preserve"> (quem criou a conta) deve ser intocável — outros usuários não podem editá-lo, desativá-lo ou remover seu cargo</w:t>
       </w:r>
     </w:p>
     <w:p>
@@ -2746,52 +2369,16 @@
       </w:pPr>
       <w:r>
         <w:rPr>
-          <w:rFonts w:ascii="Calibri" w:eastAsia="Times New Roman" w:hAnsi="Calibri" w:cs="Calibri"/>
           <w:b/>
-          <w:bCs/>
-          <w:color w:val="1A1A1A"/>
-          <w:sz w:val="22"/>
-          <w:szCs w:val="22"/>
-          <w:lang w:val="pt-BR"/>
-        </w:rPr>
-      </w:r>
-      <w:r>
-        <w:rPr>
-          <w:rFonts w:ascii="Calibri" w:eastAsia="Times New Roman" w:hAnsi="Calibri" w:cs="Calibri"/>
-          <w:color w:val="1A1A1A"/>
-          <w:sz w:val="22"/>
-          <w:szCs w:val="22"/>
-          <w:lang w:val="pt-BR"/>
-        </w:rPr>
-      </w:r>
-      <w:proofErr w:type="spellStart"/>
-      <w:r>
-        <w:rPr>
-          <w:rFonts w:ascii="Calibri" w:eastAsia="Times New Roman" w:hAnsi="Calibri" w:cs="Calibri"/>
-          <w:color w:val="1A1A1A"/>
-          <w:sz w:val="22"/>
-          <w:szCs w:val="22"/>
-          <w:lang w:val="pt-BR"/>
-        </w:rPr>
-      </w:r>
-      <w:proofErr w:type="spellEnd"/>
-      <w:r>
-        <w:rPr>
-          <w:rFonts w:ascii="Calibri" w:eastAsia="Times New Roman" w:hAnsi="Calibri" w:cs="Calibri"/>
-          <w:color w:val="1A1A1A"/>
-          <w:sz w:val="22"/>
-          <w:szCs w:val="22"/>
-          <w:lang w:val="pt-BR"/>
-        </w:rPr>
-      </w:r>
-      <w:r>
-        <w:rPr>
-          <w:b/>
-        </w:rPr>
-        <w:t>Criação de usuários pelo cliente</w:t>
-      </w:r>
-      <w:r>
-        <w:t xml:space="preserve"> — como admin@acme.dev, crie um novo usuário na Organização (usa a nova função tenant-usuarios) e confira se ele consegue logar</w:t>
+          <w:lang w:val="pt-BR"/>
+        </w:rPr>
+        <w:t>Níveis hierárquicos em cargos</w:t>
+      </w:r>
+      <w:r>
+        <w:rPr>
+          <w:lang w:val="pt-BR"/>
+        </w:rPr>
+        <w:t xml:space="preserve"> — confira em Organização → Cargos se os níveis aparecem e se um cargo de nível mais baixo não consegue alterar um de nível mais alto</w:t>
       </w:r>
     </w:p>
     <w:p>
@@ -2811,76 +2398,58 @@
       </w:pPr>
       <w:r>
         <w:rPr>
-          <w:rFonts w:ascii="Calibri" w:eastAsia="Times New Roman" w:hAnsi="Calibri" w:cs="Calibri"/>
           <w:b/>
-          <w:bCs/>
-          <w:color w:val="1A1A1A"/>
-          <w:sz w:val="22"/>
-          <w:szCs w:val="22"/>
-          <w:lang w:val="pt-BR"/>
-        </w:rPr>
-      </w:r>
-      <w:r>
-        <w:rPr>
-          <w:rFonts w:ascii="Calibri" w:eastAsia="Times New Roman" w:hAnsi="Calibri" w:cs="Calibri"/>
-          <w:color w:val="1A1A1A"/>
-          <w:sz w:val="22"/>
-          <w:szCs w:val="22"/>
-          <w:lang w:val="pt-BR"/>
-        </w:rPr>
+          <w:lang w:val="pt-BR"/>
+        </w:rPr>
+        <w:t>Criação de usuários pelo cliente</w:t>
+      </w:r>
+      <w:r>
+        <w:rPr>
+          <w:lang w:val="pt-BR"/>
+        </w:rPr>
+        <w:t xml:space="preserve"> — como </w:t>
       </w:r>
       <w:proofErr w:type="spellStart"/>
       <w:r>
         <w:rPr>
-          <w:rFonts w:ascii="Calibri" w:eastAsia="Times New Roman" w:hAnsi="Calibri" w:cs="Calibri"/>
-          <w:color w:val="1A1A1A"/>
-          <w:sz w:val="22"/>
-          <w:szCs w:val="22"/>
-          <w:lang w:val="pt-BR"/>
-        </w:rPr>
+          <w:lang w:val="pt-BR"/>
+        </w:rPr>
+        <w:t>admin@acme.dev</w:t>
       </w:r>
       <w:proofErr w:type="spellEnd"/>
       <w:r>
         <w:rPr>
-          <w:rFonts w:ascii="Calibri" w:eastAsia="Times New Roman" w:hAnsi="Calibri" w:cs="Calibri"/>
-          <w:color w:val="1A1A1A"/>
-          <w:sz w:val="22"/>
-          <w:szCs w:val="22"/>
-          <w:lang w:val="pt-BR"/>
-        </w:rPr>
-      </w:r>
-      <w:r>
-        <w:rPr>
-          <w:b/>
-        </w:rPr>
-        <w:t>Reforço no banco</w:t>
-      </w:r>
-      <w:r>
-        <w:t xml:space="preserve"> — tente, como membro@acme.dev, alterar cargo ou desativar outro usuário diretamente — deve ser bloqueado mesmo que a interface escondesse o botão</w:t>
-      </w:r>
-    </w:p>
-    <w:p>
-      <w:pPr>
-        <w:pStyle w:val="Ttulo2"/>
-      </w:pPr>
-      <w:r>
-        <w:t>Limitação conhecida: o assistente de IA</w:t>
-      </w:r>
-    </w:p>
-    <w:p>
-      <w:pPr>
-        <w:pStyle w:val="NormalWeb"/>
-      </w:pPr>
-      <w:r>
-        <w:t>O Chat com IA responde "Assistente indisponível no momento" — falta crédito na conta da OpenAI, não é defeito. O resto do sistema funciona normalmente.</w:t>
-      </w:r>
-    </w:p>
-    <w:p>
-      <w:pPr>
-        <w:pStyle w:val="Ttulo2"/>
-      </w:pPr>
-      <w:r>
-        <w:t>Antes de reportar um problema</w:t>
+          <w:lang w:val="pt-BR"/>
+        </w:rPr>
+        <w:t xml:space="preserve">, </w:t>
+      </w:r>
+      <w:proofErr w:type="gramStart"/>
+      <w:r>
+        <w:rPr>
+          <w:lang w:val="pt-BR"/>
+        </w:rPr>
+        <w:t>crie um novo</w:t>
+      </w:r>
+      <w:proofErr w:type="gramEnd"/>
+      <w:r>
+        <w:rPr>
+          <w:lang w:val="pt-BR"/>
+        </w:rPr>
+        <w:t xml:space="preserve"> usuário na Organização (usa a nova função </w:t>
+      </w:r>
+      <w:proofErr w:type="spellStart"/>
+      <w:r>
+        <w:rPr>
+          <w:lang w:val="pt-BR"/>
+        </w:rPr>
+        <w:t>tenant-usuarios</w:t>
+      </w:r>
+      <w:proofErr w:type="spellEnd"/>
+      <w:r>
+        <w:rPr>
+          <w:lang w:val="pt-BR"/>
+        </w:rPr>
+        <w:t>) e confira se ele consegue logar</w:t>
       </w:r>
     </w:p>
     <w:p>
@@ -2900,52 +2469,72 @@
       </w:pPr>
       <w:r>
         <w:rPr>
-          <w:rFonts w:ascii="Calibri" w:eastAsia="Times New Roman" w:hAnsi="Calibri" w:cs="Calibri"/>
           <w:b/>
-          <w:bCs/>
-          <w:color w:val="1A1A1A"/>
-          <w:sz w:val="22"/>
-          <w:szCs w:val="22"/>
-          <w:lang w:val="pt-BR"/>
-        </w:rPr>
-      </w:r>
-      <w:r>
-        <w:rPr>
-          <w:rFonts w:ascii="Calibri" w:eastAsia="Times New Roman" w:hAnsi="Calibri" w:cs="Calibri"/>
-          <w:color w:val="1A1A1A"/>
-          <w:sz w:val="22"/>
-          <w:szCs w:val="22"/>
-          <w:lang w:val="pt-BR"/>
-        </w:rPr>
+          <w:lang w:val="pt-BR"/>
+        </w:rPr>
+        <w:t>Reforço no banco</w:t>
+      </w:r>
+      <w:r>
+        <w:rPr>
+          <w:lang w:val="pt-BR"/>
+        </w:rPr>
+        <w:t xml:space="preserve"> — tente, como </w:t>
       </w:r>
       <w:proofErr w:type="spellStart"/>
       <w:r>
         <w:rPr>
-          <w:rFonts w:ascii="Calibri" w:eastAsia="Times New Roman" w:hAnsi="Calibri" w:cs="Calibri"/>
-          <w:color w:val="1A1A1A"/>
-          <w:sz w:val="22"/>
-          <w:szCs w:val="22"/>
-          <w:lang w:val="pt-BR"/>
-        </w:rPr>
+          <w:lang w:val="pt-BR"/>
+        </w:rPr>
+        <w:t>membro@acme.dev</w:t>
       </w:r>
       <w:proofErr w:type="spellEnd"/>
       <w:r>
         <w:rPr>
-          <w:rFonts w:ascii="Calibri" w:eastAsia="Times New Roman" w:hAnsi="Calibri" w:cs="Calibri"/>
-          <w:color w:val="1A1A1A"/>
-          <w:sz w:val="22"/>
-          <w:szCs w:val="22"/>
-          <w:lang w:val="pt-BR"/>
-        </w:rPr>
-      </w:r>
-      <w:r>
-        <w:rPr>
-          <w:b/>
-        </w:rPr>
-        <w:t>Você está em dev?</w:t>
-      </w:r>
-      <w:r>
-        <w:t xml:space="preserve"> — confira o rótulo [DEV] no nome do sistema; produção não deve ser usada para teste</w:t>
+          <w:lang w:val="pt-BR"/>
+        </w:rPr>
+        <w:t>, alterar cargo ou desativar outro usuário diretamente — deve ser bloqueado mesmo que a interface escondesse o botão</w:t>
+      </w:r>
+    </w:p>
+    <w:p>
+      <w:pPr>
+        <w:pStyle w:val="Ttulo2"/>
+        <w:rPr>
+          <w:lang w:val="pt-BR"/>
+        </w:rPr>
+      </w:pPr>
+      <w:r>
+        <w:rPr>
+          <w:lang w:val="pt-BR"/>
+        </w:rPr>
+        <w:t>Limitação conhecida: o assistente de IA</w:t>
+      </w:r>
+    </w:p>
+    <w:p>
+      <w:pPr>
+        <w:pStyle w:val="NormalWeb"/>
+        <w:rPr>
+          <w:lang w:val="pt-BR"/>
+        </w:rPr>
+      </w:pPr>
+      <w:r>
+        <w:rPr>
+          <w:lang w:val="pt-BR"/>
+        </w:rPr>
+        <w:t>O Chat com IA responde "Assistente indisponível no momento" — falta crédito na conta da OpenAI, não é defeito. O resto do sistema funciona normalmente.</w:t>
+      </w:r>
+    </w:p>
+    <w:p>
+      <w:pPr>
+        <w:pStyle w:val="Ttulo2"/>
+        <w:rPr>
+          <w:lang w:val="pt-BR"/>
+        </w:rPr>
+      </w:pPr>
+      <w:r>
+        <w:rPr>
+          <w:lang w:val="pt-BR"/>
+        </w:rPr>
+        <w:t>Antes de reportar um problema</w:t>
       </w:r>
     </w:p>
     <w:p>
@@ -2965,52 +2554,32 @@
       </w:pPr>
       <w:r>
         <w:rPr>
-          <w:rFonts w:ascii="Calibri" w:eastAsia="Times New Roman" w:hAnsi="Calibri" w:cs="Calibri"/>
           <w:b/>
-          <w:bCs/>
-          <w:color w:val="1A1A1A"/>
-          <w:sz w:val="22"/>
-          <w:szCs w:val="22"/>
-          <w:lang w:val="pt-BR"/>
-        </w:rPr>
-      </w:r>
-      <w:r>
-        <w:rPr>
-          <w:rFonts w:ascii="Calibri" w:eastAsia="Times New Roman" w:hAnsi="Calibri" w:cs="Calibri"/>
-          <w:color w:val="1A1A1A"/>
-          <w:sz w:val="22"/>
-          <w:szCs w:val="22"/>
-          <w:lang w:val="pt-BR"/>
-        </w:rPr>
+          <w:lang w:val="pt-BR"/>
+        </w:rPr>
+        <w:t xml:space="preserve">Você está em </w:t>
       </w:r>
       <w:proofErr w:type="spellStart"/>
       <w:r>
         <w:rPr>
-          <w:rFonts w:ascii="Calibri" w:eastAsia="Times New Roman" w:hAnsi="Calibri" w:cs="Calibri"/>
-          <w:color w:val="1A1A1A"/>
-          <w:sz w:val="22"/>
-          <w:szCs w:val="22"/>
-          <w:lang w:val="pt-BR"/>
-        </w:rPr>
+          <w:b/>
+          <w:lang w:val="pt-BR"/>
+        </w:rPr>
+        <w:t>dev</w:t>
       </w:r>
       <w:proofErr w:type="spellEnd"/>
       <w:r>
         <w:rPr>
-          <w:rFonts w:ascii="Calibri" w:eastAsia="Times New Roman" w:hAnsi="Calibri" w:cs="Calibri"/>
-          <w:color w:val="1A1A1A"/>
-          <w:sz w:val="22"/>
-          <w:szCs w:val="22"/>
-          <w:lang w:val="pt-BR"/>
-        </w:rPr>
-      </w:r>
-      <w:r>
-        <w:rPr>
           <w:b/>
-        </w:rPr>
-        <w:t>Qual conta?</w:t>
-      </w:r>
-      <w:r>
-        <w:t xml:space="preserve"> — o cargo muda o que aparece na tela — um botão ausente pode ser permissão, não bug</w:t>
+          <w:lang w:val="pt-BR"/>
+        </w:rPr>
+        <w:t>?</w:t>
+      </w:r>
+      <w:r>
+        <w:rPr>
+          <w:lang w:val="pt-BR"/>
+        </w:rPr>
+        <w:t xml:space="preserve"> — confira o rótulo [DEV] no nome do sistema; produção não deve ser usada para teste</w:t>
       </w:r>
     </w:p>
     <w:p>
@@ -3030,16 +2599,25 @@
       </w:pPr>
       <w:r>
         <w:rPr>
-          <w:rFonts w:ascii="Calibri" w:eastAsia="Times New Roman" w:hAnsi="Calibri" w:cs="Calibri"/>
           <w:b/>
-          <w:bCs/>
-          <w:color w:val="1A1A1A"/>
-          <w:sz w:val="22"/>
-          <w:szCs w:val="22"/>
-          <w:lang w:val="pt-BR"/>
-        </w:rPr>
-      </w:r>
-      <w:r>
+          <w:lang w:val="pt-BR"/>
+        </w:rPr>
+        <w:t>Qual conta?</w:t>
+      </w:r>
+      <w:r>
+        <w:rPr>
+          <w:lang w:val="pt-BR"/>
+        </w:rPr>
+        <w:t xml:space="preserve"> — o cargo muda o que aparece na tela — um botão ausente pode ser permissão, não bug</w:t>
+      </w:r>
+    </w:p>
+    <w:p>
+      <w:pPr>
+        <w:numPr>
+          <w:ilvl w:val="0"/>
+          <w:numId w:val="1"/>
+        </w:numPr>
+        <w:spacing w:before="100" w:beforeAutospacing="1" w:after="100" w:afterAutospacing="1"/>
         <w:rPr>
           <w:rFonts w:ascii="Calibri" w:eastAsia="Times New Roman" w:hAnsi="Calibri" w:cs="Calibri"/>
           <w:color w:val="1A1A1A"/>
@@ -3047,34 +2625,27 @@
           <w:szCs w:val="22"/>
           <w:lang w:val="pt-BR"/>
         </w:rPr>
+      </w:pPr>
+      <w:r>
+        <w:rPr>
+          <w:b/>
+          <w:lang w:val="pt-BR"/>
+        </w:rPr>
+        <w:t xml:space="preserve">Recarregue com </w:t>
       </w:r>
       <w:proofErr w:type="spellStart"/>
       <w:r>
         <w:rPr>
-          <w:rFonts w:ascii="Calibri" w:eastAsia="Times New Roman" w:hAnsi="Calibri" w:cs="Calibri"/>
-          <w:color w:val="1A1A1A"/>
-          <w:sz w:val="22"/>
-          <w:szCs w:val="22"/>
-          <w:lang w:val="pt-BR"/>
-        </w:rPr>
+          <w:b/>
+          <w:lang w:val="pt-BR"/>
+        </w:rPr>
+        <w:t>Ctrl+Shift+R</w:t>
       </w:r>
       <w:proofErr w:type="spellEnd"/>
       <w:r>
         <w:rPr>
-          <w:rFonts w:ascii="Calibri" w:eastAsia="Times New Roman" w:hAnsi="Calibri" w:cs="Calibri"/>
-          <w:color w:val="1A1A1A"/>
-          <w:sz w:val="22"/>
-          <w:szCs w:val="22"/>
-          <w:lang w:val="pt-BR"/>
-        </w:rPr>
-      </w:r>
-      <w:r>
-        <w:rPr>
-          <w:b/>
-        </w:rPr>
-        <w:t>Recarregue com Ctrl+Shift+R</w:t>
-      </w:r>
-      <w:r>
+          <w:lang w:val="pt-BR"/>
+        </w:rPr>
         <w:t xml:space="preserve"> — o navegador guarda versões antigas do sistema</w:t>
       </w:r>
     </w:p>
@@ -3083,7 +2654,21 @@
         <w:pStyle w:val="NormalWeb"/>
       </w:pPr>
       <w:r>
-        <w:t>Ao relatar, diga a conta usada, qual bloco/funcionalidade, o que você esperava e o que aconteceu. Print ajuda.</w:t>
+        <w:rPr>
+          <w:lang w:val="pt-BR"/>
+        </w:rPr>
+        <w:t xml:space="preserve">Ao relatar, diga a conta usada, qual bloco/funcionalidade, o que você esperava e o que aconteceu. </w:t>
+      </w:r>
+      <w:r>
+        <w:t xml:space="preserve">Print </w:t>
+      </w:r>
+      <w:proofErr w:type="spellStart"/>
+      <w:r>
+        <w:t>ajuda</w:t>
+      </w:r>
+      <w:proofErr w:type="spellEnd"/>
+      <w:r>
+        <w:t>.</w:t>
       </w:r>
     </w:p>
     <w:sectPr>
@@ -3097,7 +2682,7 @@
 </file>
 
 <file path=word/numbering.xml><?xml version="1.0" encoding="utf-8"?>
-<w:numbering xmlns:wpc="http://schemas.microsoft.com/office/word/2010/wordprocessingCanvas" xmlns:cx="http://schemas.microsoft.com/office/drawing/2014/chartex" xmlns:cx1="http://schemas.microsoft.com/office/drawing/2015/9/8/chartex" xmlns:cx2="http://schemas.microsoft.com/office/drawing/2015/10/21/chartex" xmlns:cx3="http://schemas.microsoft.com/office/drawing/2016/5/9/chartex" xmlns:cx4="http://schemas.microsoft.com/office/drawing/2016/5/10/chartex" xmlns:cx5="http://schemas.microsoft.com/office/drawing/2016/5/11/chartex" xmlns:cx6="http://schemas.microsoft.com/office/drawing/2016/5/12/chartex" xmlns:cx7="http://schemas.microsoft.com/office/drawing/2016/5/13/chartex" xmlns:cx8="http://schemas.microsoft.com/office/drawing/2016/5/14/chartex" xmlns:mc="http://schemas.openxmlformats.org/markup-compatibility/2006" xmlns:aink="http://schemas.microsoft.com/office/drawing/2016/ink" xmlns:am3d="http://schemas.microsoft.com/office/drawing/2017/model3d" xmlns:o="urn:schemas-microsoft-com:office:office" xmlns:oel="http://schemas.microsoft.com/office/2019/extlst" xmlns:r="http://schemas.openxmlformats.org/officeDocument/2006/relationships" xmlns:m="http://schemas.openxmlformats.org/officeDocument/2006/math" xmlns:v="urn:schemas-microsoft-com:vml" xmlns:wp14="http://schemas.microsoft.com/office/word/2010/wordprocessingDrawing" xmlns:wp="http://schemas.openxmlformats.org/drawingml/2006/wordprocessingDrawing" xmlns:w10="urn:schemas-microsoft-com:office:word" xmlns:w="http://schemas.openxmlformats.org/wordprocessingml/2006/main" xmlns:w14="http://schemas.microsoft.com/office/word/2010/wordml" xmlns:w15="http://schemas.microsoft.com/office/word/2012/wordml" xmlns:w16cei="http://schemas.microsoft.com/office/word/2026/wordml/cei" xmlns:w16cex="http://schemas.microsoft.com/office/word/2018/wordml/cex" xmlns:w16cid="http://schemas.microsoft.com/office/word/2016/wordml/cid" xmlns:w16="http://schemas.microsoft.com/office/word/2018/wordml" xmlns:w16du="http://schemas.microsoft.com/office/word/2023/wordml/word16du" xmlns:w16sdtdh="http://schemas.microsoft.com/office/word/2020/wordml/sdtdatahash" xmlns:w16sdtfl="http://schemas.microsoft.com/office/word/2024/wordml/sdtformatlock" xmlns:w16se="http://schemas.microsoft.com/office/word/2015/wordml/symex" xmlns:wpg="http://schemas.microsoft.com/office/word/2010/wordprocessingGroup" xmlns:wpi="http://schemas.microsoft.com/office/word/2010/wordprocessingInk" xmlns:wne="http://schemas.microsoft.com/office/word/2006/wordml" xmlns:wps="http://schemas.microsoft.com/office/word/2010/wordprocessingShape" mc:Ignorable="w14 w15 w16se w16cid w16 w16cex w16sdtdh w16sdtfl w16du wp14">
+<w:numbering xmlns:wpc="http://schemas.microsoft.com/office/word/2010/wordprocessingCanvas" xmlns:cx="http://schemas.microsoft.com/office/drawing/2014/chartex" xmlns:cx1="http://schemas.microsoft.com/office/drawing/2015/9/8/chartex" xmlns:cx2="http://schemas.microsoft.com/office/drawing/2015/10/21/chartex" xmlns:cx3="http://schemas.microsoft.com/office/drawing/2016/5/9/chartex" xmlns:cx4="http://schemas.microsoft.com/office/drawing/2016/5/10/chartex" xmlns:cx5="http://schemas.microsoft.com/office/drawing/2016/5/11/chartex" xmlns:cx6="http://schemas.microsoft.com/office/drawing/2016/5/12/chartex" xmlns:cx7="http://schemas.microsoft.com/office/drawing/2016/5/13/chartex" xmlns:cx8="http://schemas.microsoft.com/office/drawing/2016/5/14/chartex" xmlns:mc="http://schemas.openxmlformats.org/markup-compatibility/2006" xmlns:aink="http://schemas.microsoft.com/office/drawing/2016/ink" xmlns:am3d="http://schemas.microsoft.com/office/drawing/2017/model3d" xmlns:o="urn:schemas-microsoft-com:office:office" xmlns:oel="http://schemas.microsoft.com/office/2019/extlst" xmlns:r="http://schemas.openxmlformats.org/officeDocument/2006/relationships" xmlns:m="http://schemas.openxmlformats.org/officeDocument/2006/math" xmlns:v="urn:schemas-microsoft-com:vml" xmlns:wp14="http://schemas.microsoft.com/office/word/2010/wordprocessingDrawing" xmlns:wp="http://schemas.openxmlformats.org/drawingml/2006/wordprocessingDrawing" xmlns:w10="urn:schemas-microsoft-com:office:word" xmlns:w="http://schemas.openxmlformats.org/wordprocessingml/2006/main" xmlns:w14="http://schemas.microsoft.com/office/word/2010/wordml" xmlns:w15="http://schemas.microsoft.com/office/word/2012/wordml" xmlns:w16cex="http://schemas.microsoft.com/office/word/2018/wordml/cex" xmlns:w16cid="http://schemas.microsoft.com/office/word/2016/wordml/cid" xmlns:w16="http://schemas.microsoft.com/office/word/2018/wordml" xmlns:w16du="http://schemas.microsoft.com/office/word/2023/wordml/word16du" xmlns:w16sdtdh="http://schemas.microsoft.com/office/word/2020/wordml/sdtdatahash" xmlns:w16sdtfl="http://schemas.microsoft.com/office/word/2024/wordml/sdtformatlock" xmlns:w16se="http://schemas.microsoft.com/office/word/2015/wordml/symex" xmlns:wpg="http://schemas.microsoft.com/office/word/2010/wordprocessingGroup" xmlns:wpi="http://schemas.microsoft.com/office/word/2010/wordprocessingInk" xmlns:wne="http://schemas.microsoft.com/office/word/2006/wordml" xmlns:wps="http://schemas.microsoft.com/office/word/2010/wordprocessingShape" mc:Ignorable="w14 w15 w16se w16cid w16 w16cex w16sdtdh w16sdtfl w16du wp14">
   <w:abstractNum w:abstractNumId="0" w15:restartNumberingAfterBreak="0">
     <w:nsid w:val="4C1C1495"/>
     <w:multiLevelType w:val="multilevel"/>

</xml_diff>